<commit_message>
feat(talento-tecnico): adecuar programa a formato de vinculacion empresarial (1 mes, virtual semanal + 2 presenciales) y respaldar historico
</commit_message>
<xml_diff>
--- a/Cursos/Talento_Tecnico/Propuesta_Diplomado_Talento_Tecnico_Kinal.docx
+++ b/Cursos/Talento_Tecnico/Propuesta_Diplomado_Talento_Tecnico_Kinal.docx
@@ -4,7 +4,7 @@
   <w:body>
     <w:p>
       <w:pPr>
-        <w:spacing w:before="400" w:after="40" w:line="276" w:lineRule="auto"/>
+        <w:spacing w:before="300" w:after="40" w:line="276" w:lineRule="auto"/>
       </w:pPr>
       <w:r>
         <w:rPr>
@@ -18,7 +18,7 @@
     </w:p>
     <w:p>
       <w:pPr>
-        <w:spacing w:before="0" w:after="400" w:line="276" w:lineRule="auto"/>
+        <w:spacing w:before="0" w:after="360" w:line="276" w:lineRule="auto"/>
       </w:pPr>
       <w:r>
         <w:rPr>
@@ -26,37 +26,37 @@
           <w:color w:val="4A5568"/>
           <w:sz w:val="22"/>
         </w:rPr>
-        <w:t>Escuela Técnica Superior — Centro de Desarrollo Empresarial y Formación Continua</w:t>
+        <w:t>Dirección de Vinculación Empresarial — Escuela Técnica Superior</w:t>
       </w:r>
     </w:p>
     <w:p>
       <w:pPr>
-        <w:spacing w:before="280" w:after="200" w:line="276" w:lineRule="auto"/>
+        <w:spacing w:before="200" w:after="160" w:line="276" w:lineRule="auto"/>
       </w:pPr>
       <w:r>
         <w:rPr>
           <w:rFonts w:ascii="Calibri" w:hAnsi="Calibri"/>
           <w:b/>
           <w:color w:val="003366"/>
-          <w:sz w:val="34"/>
+          <w:sz w:val="32"/>
         </w:rPr>
-        <w:t>PLANIFICACIÓN Y PROPUESTA FORMATIVA INSTITUCIONAL:</w:t>
+        <w:t>PROPUESTA FORMATIVA Y MODELO DE VINCULACIÓN EMPRESARIAL:</w:t>
         <w:br/>
-        <w:t>DIPLOMADO DE CERTIFICACIÓN GERENCIAL EN GESTIÓN ESTRATÉGICA DEL TALENTO TÉCNICO</w:t>
+        <w:t>PROGRAMA EJECUTIVO EN GESTIÓN DEL TALENTO TÉCNICO, LIDERAZGO Y FACTOR HUMANO</w:t>
       </w:r>
     </w:p>
     <w:p>
       <w:pPr>
-        <w:spacing w:before="0" w:after="400" w:line="276" w:lineRule="auto"/>
+        <w:spacing w:before="0" w:after="360" w:line="276" w:lineRule="auto"/>
       </w:pPr>
       <w:r>
         <w:rPr>
           <w:rFonts w:ascii="Calibri" w:hAnsi="Calibri"/>
           <w:i/>
           <w:color w:val="4A5568"/>
-          <w:sz w:val="23"/>
+          <w:sz w:val="22"/>
         </w:rPr>
-        <w:t>Programa Ejecutivo Híbrido para la Alta Dirección y Líderes de Talento: Capitalizando el Valor del Técnico Superior Universitario (TSU), la Formación Dual y la Cultura del Factor Humano (4 Semanas Intensivas Consecutivas)</w:t>
+        <w:t>Iniciativa Institucional de Diálogo y Fortalecimiento para Líderes de Equipos y Mandos Medios frente a las Demandas Actuales de la Industria (1 Mes de Duración | Modalidad Virtual Semanal + 2 Jornadas Presenciales Especiales)</w:t>
       </w:r>
     </w:p>
     <w:tbl>
@@ -75,8 +75,8 @@
         </w:tblBorders>
       </w:tblPr>
       <w:tblGrid>
-        <w:gridCol w:w="3168"/>
-        <w:gridCol w:w="6192"/>
+        <w:gridCol w:w="3312"/>
+        <w:gridCol w:w="6048"/>
       </w:tblGrid>
       <w:tr>
         <w:tc>
@@ -84,10 +84,10 @@
             <w:tcW w:type="dxa" w:w="4680"/>
             <w:shd w:fill="F7FAFC"/>
             <w:tcMar>
-              <w:top w:w="65" w:type="dxa"/>
-              <w:bottom w:w="65" w:type="dxa"/>
-              <w:left w:w="90" w:type="dxa"/>
-              <w:right w:w="90" w:type="dxa"/>
+              <w:top w:w="60" w:type="dxa"/>
+              <w:bottom w:w="60" w:type="dxa"/>
+              <w:left w:w="80" w:type="dxa"/>
+              <w:right w:w="80" w:type="dxa"/>
             </w:tcMar>
           </w:tcPr>
           <w:p>
@@ -101,7 +101,7 @@
                 <w:color w:val="003366"/>
                 <w:sz w:val="19"/>
               </w:rPr>
-              <w:t>Nivel Formativo de Referencia:</w:t>
+              <w:t>Naturaleza del Programa:</w:t>
             </w:r>
           </w:p>
         </w:tc>
@@ -109,10 +109,10 @@
           <w:tcPr>
             <w:tcW w:type="dxa" w:w="4680"/>
             <w:tcMar>
-              <w:top w:w="65" w:type="dxa"/>
-              <w:bottom w:w="65" w:type="dxa"/>
-              <w:left w:w="90" w:type="dxa"/>
-              <w:right w:w="90" w:type="dxa"/>
+              <w:top w:w="60" w:type="dxa"/>
+              <w:bottom w:w="60" w:type="dxa"/>
+              <w:left w:w="80" w:type="dxa"/>
+              <w:right w:w="80" w:type="dxa"/>
             </w:tcMar>
           </w:tcPr>
           <w:p>
@@ -125,7 +125,7 @@
                 <w:color w:val="1A202C"/>
                 <w:sz w:val="19"/>
               </w:rPr>
-              <w:t>Equivalencia DQR Nivel 6 - 7 (Dirección estratégica de talento, diseño organizacional y liderazgo)</w:t>
+              <w:t>Iniciativa de vinculación empresarial y fortalecimiento directivo en gestión del talento operativo</w:t>
             </w:r>
           </w:p>
         </w:tc>
@@ -136,10 +136,10 @@
             <w:tcW w:type="dxa" w:w="4680"/>
             <w:shd w:fill="F7FAFC"/>
             <w:tcMar>
-              <w:top w:w="65" w:type="dxa"/>
-              <w:bottom w:w="65" w:type="dxa"/>
-              <w:left w:w="90" w:type="dxa"/>
-              <w:right w:w="90" w:type="dxa"/>
+              <w:top w:w="60" w:type="dxa"/>
+              <w:bottom w:w="60" w:type="dxa"/>
+              <w:left w:w="80" w:type="dxa"/>
+              <w:right w:w="80" w:type="dxa"/>
             </w:tcMar>
           </w:tcPr>
           <w:p>
@@ -161,10 +161,10 @@
           <w:tcPr>
             <w:tcW w:type="dxa" w:w="4680"/>
             <w:tcMar>
-              <w:top w:w="65" w:type="dxa"/>
-              <w:bottom w:w="65" w:type="dxa"/>
-              <w:left w:w="90" w:type="dxa"/>
-              <w:right w:w="90" w:type="dxa"/>
+              <w:top w:w="60" w:type="dxa"/>
+              <w:bottom w:w="60" w:type="dxa"/>
+              <w:left w:w="80" w:type="dxa"/>
+              <w:right w:w="80" w:type="dxa"/>
             </w:tcMar>
           </w:tcPr>
           <w:p>
@@ -177,7 +177,7 @@
                 <w:color w:val="1A202C"/>
                 <w:sz w:val="19"/>
               </w:rPr>
-              <w:t>Gerentes Generales, Gerentes de Talento Humano / RRHH, Reclutadores y Gerentes de Operaciones/Planta</w:t>
+              <w:t>Representantes empresariales: Gerentes Generales, Gerentes de Operaciones/Planta, Directores de Talento Humano / RRHH, Reclutadores y Mandos Medios con equipos a su cargo</w:t>
             </w:r>
           </w:p>
         </w:tc>
@@ -188,10 +188,10 @@
             <w:tcW w:type="dxa" w:w="4680"/>
             <w:shd w:fill="F7FAFC"/>
             <w:tcMar>
-              <w:top w:w="65" w:type="dxa"/>
-              <w:bottom w:w="65" w:type="dxa"/>
-              <w:left w:w="90" w:type="dxa"/>
-              <w:right w:w="90" w:type="dxa"/>
+              <w:top w:w="60" w:type="dxa"/>
+              <w:bottom w:w="60" w:type="dxa"/>
+              <w:left w:w="80" w:type="dxa"/>
+              <w:right w:w="80" w:type="dxa"/>
             </w:tcMar>
           </w:tcPr>
           <w:p>
@@ -213,10 +213,10 @@
           <w:tcPr>
             <w:tcW w:type="dxa" w:w="4680"/>
             <w:tcMar>
-              <w:top w:w="65" w:type="dxa"/>
-              <w:bottom w:w="65" w:type="dxa"/>
-              <w:left w:w="90" w:type="dxa"/>
-              <w:right w:w="90" w:type="dxa"/>
+              <w:top w:w="60" w:type="dxa"/>
+              <w:bottom w:w="60" w:type="dxa"/>
+              <w:left w:w="80" w:type="dxa"/>
+              <w:right w:w="80" w:type="dxa"/>
             </w:tcMar>
           </w:tcPr>
           <w:p>
@@ -229,7 +229,7 @@
                 <w:color w:val="1A202C"/>
                 <w:sz w:val="19"/>
               </w:rPr>
-              <w:t>32 horas directas sincrónicas/presenciales (40 horas formativas totales en 4 semanas consecutivas intensivas)</w:t>
+              <w:t>1 mes de duración (4 semanas) | 16 horas de contacto directo sincrónico/presencial + 4 horas de autodiagnóstico empresarial (20 horas formativas ejecutivas totales)</w:t>
             </w:r>
           </w:p>
         </w:tc>
@@ -240,10 +240,10 @@
             <w:tcW w:type="dxa" w:w="4680"/>
             <w:shd w:fill="F7FAFC"/>
             <w:tcMar>
-              <w:top w:w="65" w:type="dxa"/>
-              <w:bottom w:w="65" w:type="dxa"/>
-              <w:left w:w="90" w:type="dxa"/>
-              <w:right w:w="90" w:type="dxa"/>
+              <w:top w:w="60" w:type="dxa"/>
+              <w:bottom w:w="60" w:type="dxa"/>
+              <w:left w:w="80" w:type="dxa"/>
+              <w:right w:w="80" w:type="dxa"/>
             </w:tcMar>
           </w:tcPr>
           <w:p>
@@ -265,10 +265,10 @@
           <w:tcPr>
             <w:tcW w:type="dxa" w:w="4680"/>
             <w:tcMar>
-              <w:top w:w="65" w:type="dxa"/>
-              <w:bottom w:w="65" w:type="dxa"/>
-              <w:left w:w="90" w:type="dxa"/>
-              <w:right w:w="90" w:type="dxa"/>
+              <w:top w:w="60" w:type="dxa"/>
+              <w:bottom w:w="60" w:type="dxa"/>
+              <w:left w:w="80" w:type="dxa"/>
+              <w:right w:w="80" w:type="dxa"/>
             </w:tcMar>
           </w:tcPr>
           <w:p>
@@ -281,7 +281,7 @@
                 <w:color w:val="1A202C"/>
                 <w:sz w:val="19"/>
               </w:rPr>
-              <w:t>Híbrido: 16h Virtual Sincrónico (Microsoft Teams) + 16h Presencial (4 Sábados consecutivos en Kinal) + Kinal.academy</w:t>
+              <w:t>Híbrida: 1 sesión virtual semanal de 2 horas en Microsoft Teams (8h virtuales) + 2 jornadas presenciales especiales en campus Kinal (8h presenciales)</w:t>
             </w:r>
           </w:p>
         </w:tc>
@@ -292,10 +292,10 @@
             <w:tcW w:type="dxa" w:w="4680"/>
             <w:shd w:fill="F7FAFC"/>
             <w:tcMar>
-              <w:top w:w="65" w:type="dxa"/>
-              <w:bottom w:w="65" w:type="dxa"/>
-              <w:left w:w="90" w:type="dxa"/>
-              <w:right w:w="90" w:type="dxa"/>
+              <w:top w:w="60" w:type="dxa"/>
+              <w:bottom w:w="60" w:type="dxa"/>
+              <w:left w:w="80" w:type="dxa"/>
+              <w:right w:w="80" w:type="dxa"/>
             </w:tcMar>
           </w:tcPr>
           <w:p>
@@ -309,7 +309,7 @@
                 <w:color w:val="003366"/>
                 <w:sz w:val="19"/>
               </w:rPr>
-              <w:t>Estructura de Horarios:</w:t>
+              <w:t>Jornadas Presenciales Especiales:</w:t>
             </w:r>
           </w:p>
         </w:tc>
@@ -317,10 +317,10 @@
           <w:tcPr>
             <w:tcW w:type="dxa" w:w="4680"/>
             <w:tcMar>
-              <w:top w:w="65" w:type="dxa"/>
-              <w:bottom w:w="65" w:type="dxa"/>
-              <w:left w:w="90" w:type="dxa"/>
-              <w:right w:w="90" w:type="dxa"/>
+              <w:top w:w="60" w:type="dxa"/>
+              <w:bottom w:w="60" w:type="dxa"/>
+              <w:left w:w="80" w:type="dxa"/>
+              <w:right w:w="80" w:type="dxa"/>
             </w:tcMar>
           </w:tcPr>
           <w:p>
@@ -333,7 +333,7 @@
                 <w:color w:val="1A202C"/>
                 <w:sz w:val="19"/>
               </w:rPr>
-              <w:t>Martes y Jueves (19:00 a 21:00 hrs en Teams) y 4 Sábados consecutivos (8:00 a 12:00 hrs en campus Kinal)</w:t>
+              <w:t>1) Sesión Inicial de Apertura y Presentación de la Iniciativa (Kinal) | 2) Jornada de Cierre, Diálogo Industria-Academia y Entrega de Diplomas y Reconocimientos (Kinal)</w:t>
             </w:r>
           </w:p>
         </w:tc>
@@ -344,10 +344,10 @@
             <w:tcW w:type="dxa" w:w="4680"/>
             <w:shd w:fill="F7FAFC"/>
             <w:tcMar>
-              <w:top w:w="65" w:type="dxa"/>
-              <w:bottom w:w="65" w:type="dxa"/>
-              <w:left w:w="90" w:type="dxa"/>
-              <w:right w:w="90" w:type="dxa"/>
+              <w:top w:w="60" w:type="dxa"/>
+              <w:bottom w:w="60" w:type="dxa"/>
+              <w:left w:w="80" w:type="dxa"/>
+              <w:right w:w="80" w:type="dxa"/>
             </w:tcMar>
           </w:tcPr>
           <w:p>
@@ -361,7 +361,7 @@
                 <w:color w:val="003366"/>
                 <w:sz w:val="19"/>
               </w:rPr>
-              <w:t>Ejes Estratégicos del Programa:</w:t>
+              <w:t>Ejes Temáticos Centrales:</w:t>
             </w:r>
           </w:p>
         </w:tc>
@@ -369,10 +369,10 @@
           <w:tcPr>
             <w:tcW w:type="dxa" w:w="4680"/>
             <w:tcMar>
-              <w:top w:w="65" w:type="dxa"/>
-              <w:bottom w:w="65" w:type="dxa"/>
-              <w:left w:w="90" w:type="dxa"/>
-              <w:right w:w="90" w:type="dxa"/>
+              <w:top w:w="60" w:type="dxa"/>
+              <w:bottom w:w="60" w:type="dxa"/>
+              <w:left w:w="80" w:type="dxa"/>
+              <w:right w:w="80" w:type="dxa"/>
             </w:tcMar>
           </w:tcPr>
           <w:p>
@@ -385,7 +385,7 @@
                 <w:color w:val="1A202C"/>
                 <w:sz w:val="19"/>
               </w:rPr>
-              <w:t>Valor del TSU en la industria, reclutamiento por competencias, modelos de formación dual y Factor Humano</w:t>
+              <w:t>Manejo y desarrollo de personal, Liderazgo y factor humano, Fortalecimiento de competencias técnicas, Desarrollo de mandos medios, Necesidades actuales de la industria</w:t>
             </w:r>
           </w:p>
         </w:tc>
@@ -396,10 +396,10 @@
             <w:tcW w:type="dxa" w:w="4680"/>
             <w:shd w:fill="F7FAFC"/>
             <w:tcMar>
-              <w:top w:w="65" w:type="dxa"/>
-              <w:bottom w:w="65" w:type="dxa"/>
-              <w:left w:w="90" w:type="dxa"/>
-              <w:right w:w="90" w:type="dxa"/>
+              <w:top w:w="60" w:type="dxa"/>
+              <w:bottom w:w="60" w:type="dxa"/>
+              <w:left w:w="80" w:type="dxa"/>
+              <w:right w:w="80" w:type="dxa"/>
             </w:tcMar>
           </w:tcPr>
           <w:p>
@@ -413,7 +413,7 @@
                 <w:color w:val="003366"/>
                 <w:sz w:val="19"/>
               </w:rPr>
-              <w:t>Nota Mínima Aprobatoria:</w:t>
+              <w:t>Acreditación y Reconocimiento:</w:t>
             </w:r>
           </w:p>
         </w:tc>
@@ -421,10 +421,10 @@
           <w:tcPr>
             <w:tcW w:type="dxa" w:w="4680"/>
             <w:tcMar>
-              <w:top w:w="65" w:type="dxa"/>
-              <w:bottom w:w="65" w:type="dxa"/>
-              <w:left w:w="90" w:type="dxa"/>
-              <w:right w:w="90" w:type="dxa"/>
+              <w:top w:w="60" w:type="dxa"/>
+              <w:bottom w:w="60" w:type="dxa"/>
+              <w:left w:w="80" w:type="dxa"/>
+              <w:right w:w="80" w:type="dxa"/>
             </w:tcMar>
           </w:tcPr>
           <w:p>
@@ -437,7 +437,7 @@
                 <w:color w:val="1A202C"/>
                 <w:sz w:val="19"/>
               </w:rPr>
-              <w:t>75 puntos sobre 100 en análisis de casos, auditoría de competencias y Proyecto Directivo Capstone</w:t>
+              <w:t>Diploma de Participación Institucional y Reconocimiento Empresarial otorgado por Fundación Kinal a la empresa y a su representante (Aprobación &gt;= 75 pts)</w:t>
             </w:r>
           </w:p>
         </w:tc>
@@ -448,10 +448,10 @@
             <w:tcW w:type="dxa" w:w="4680"/>
             <w:shd w:fill="F7FAFC"/>
             <w:tcMar>
-              <w:top w:w="65" w:type="dxa"/>
-              <w:bottom w:w="65" w:type="dxa"/>
-              <w:left w:w="90" w:type="dxa"/>
-              <w:right w:w="90" w:type="dxa"/>
+              <w:top w:w="60" w:type="dxa"/>
+              <w:bottom w:w="60" w:type="dxa"/>
+              <w:left w:w="80" w:type="dxa"/>
+              <w:right w:w="80" w:type="dxa"/>
             </w:tcMar>
           </w:tcPr>
           <w:p>
@@ -473,10 +473,10 @@
           <w:tcPr>
             <w:tcW w:type="dxa" w:w="4680"/>
             <w:tcMar>
-              <w:top w:w="65" w:type="dxa"/>
-              <w:bottom w:w="65" w:type="dxa"/>
-              <w:left w:w="90" w:type="dxa"/>
-              <w:right w:w="90" w:type="dxa"/>
+              <w:top w:w="60" w:type="dxa"/>
+              <w:bottom w:w="60" w:type="dxa"/>
+              <w:left w:w="80" w:type="dxa"/>
+              <w:right w:w="80" w:type="dxa"/>
             </w:tcMar>
           </w:tcPr>
           <w:p>
@@ -512,7 +512,7 @@
           <w:color w:val="003366"/>
           <w:sz w:val="30"/>
         </w:rPr>
-        <w:t>1. Marco Filosófico e Ideario Institucional de Fundación Kinal</w:t>
+        <w:t>1. Marco Institucional e Ideario de Fundación Kinal</w:t>
       </w:r>
     </w:p>
     <w:p>
@@ -525,7 +525,7 @@
           <w:color w:val="1A202C"/>
           <w:sz w:val="21"/>
         </w:rPr>
-        <w:t>Este diplomado gerencial se sustenta en la visión humanística del trabajo de Fundación Kinal, la cual postula que la rentabilidad y la eficiencia operativa de una organización son fruto directo de la dignidad, la formación integral y el cuidado de las personas que la integran:</w:t>
+        <w:t>Fundación Kinal impulsa esta iniciativa directiva sustentada en su vocación histórica de servicio a la sociedad guatemalteca, integrando la excelencia técnica y operativa con el cultivo permanente de los valores humanos fundamentales:</w:t>
       </w:r>
     </w:p>
     <w:tbl>
@@ -584,7 +584,7 @@
     </w:tbl>
     <w:p>
       <w:pPr>
-        <w:spacing w:before="0" w:after="120" w:line="276" w:lineRule="auto"/>
+        <w:spacing w:before="0" w:after="80"/>
       </w:pPr>
     </w:p>
     <w:tbl>
@@ -643,7 +643,7 @@
     </w:tbl>
     <w:p>
       <w:pPr>
-        <w:spacing w:before="0" w:after="120" w:line="276" w:lineRule="auto"/>
+        <w:spacing w:before="0" w:after="80"/>
       </w:pPr>
     </w:p>
     <w:p>
@@ -656,9 +656,9 @@
           <w:rFonts w:ascii="Calibri" w:hAnsi="Calibri"/>
           <w:b/>
           <w:color w:val="003366"/>
-          <w:sz w:val="26"/>
+          <w:sz w:val="25"/>
         </w:rPr>
-        <w:t>1.1 El Factor Humano: La Rama Formativa que Transforma la Cultura Productiva</w:t>
+        <w:t>1.1 El Factor Humano: La Columna Vertebral de la Cultura Operativa</w:t>
       </w:r>
     </w:p>
     <w:p>
@@ -671,15 +671,15 @@
           <w:color w:val="1A202C"/>
           <w:sz w:val="20"/>
         </w:rPr>
-        <w:t>En la tradición formativa de Kinal, el **Factor Humano** no es un módulo accesorio ni una charla motivacional pasajera; es la columna vertebral que acompaña a cada técnico y profesional a lo largo de toda su trayectoria. En este diplomado, los líderes empresariales descubren cómo trasladar esta filosofía a sus propias organizaciones a través de valores laicos pero profundamente humanos:</w:t>
+        <w:t>En Fundación Kinal, el **Factor Humano** es una rama de formación humana laica y universal que acompaña a todos los procesos formativos y de vinculación con la empresa. En este programa para representantes empresariales, el Factor Humano se traduce en directrices operativas concretas:</w:t>
         <w:br/>
-        <w:t>• Respeto Irrenunciable a la Dignidad de la Persona: Desterrar de manera definitiva el maltrato verbal, el autoritarismo, el sarcasmo y los climas hostiles en cuadrillas de planta y taller. Reconocer que el operario técnico merece un liderazgo justo, formador y empático.</w:t>
+        <w:t>• Respeto Irrenunciable a la Dignidad de la Persona: Desterrar en forma definitiva el maltrato verbal, el autoritarismo, el sarcasmo y los climas hostiles en cuadrillas de planta y taller. Reconocer que los operarios y mandos medios merecen un liderazgo justo, formador y empático.</w:t>
         <w:br/>
-        <w:t>• El Principio del «Trabajo Bien Hecho»: La excelencia técnica cotidiana entendida como deber moral y profesional: orden estricto (5S), custodia impecable de la maquinaria, veracidad absoluta en registros de calidad y orgullo por la obra bien terminada.</w:t>
+        <w:t>• El Principio del «Trabajo Bien Hecho»: La calidad cotidiana entendida como estándar ético y deber profesional: orden riguroso (5S), custodia celosa de la maquinaria, veracidad absoluta en registros de calidad y orgullo por la obra bien terminada.</w:t>
         <w:br/>
-        <w:t>• Libertad Personal Responsable y Autonomía: Fomentar colaboradores maduros que actúan por convicción y profesionalismo, sin requerir supervisores policíacos detrás de ellos.</w:t>
+        <w:t>• Libertad Personal Responsable: Fomentar colaboradores maduros y autónomos que actúan por convicción técnica y moral, reduciendo la necesidad de supervisión policiaca.</w:t>
         <w:br/>
-        <w:t>• Espíritu de Servicio y Solidaridad: La cooperación interdepartamental genuina para derribar los silos entre operaciones, mantenimiento, recursos humanos y dirección general.</w:t>
+        <w:t>• Espíritu de Servicio y Solidaridad: La cooperación activa entre departamentos (producción, mantenimiento y calidad) para superar silos organizacionales.</w:t>
       </w:r>
     </w:p>
     <w:p>
@@ -694,7 +694,7 @@
           <w:color w:val="003366"/>
           <w:sz w:val="30"/>
         </w:rPr>
-        <w:t>2. Fundamentación Estratégica: El Retorno de Inversión del TSU</w:t>
+        <w:t>2. Fundamentación Estratégica: Vinculación y Diálogo Industria-Academia</w:t>
       </w:r>
     </w:p>
     <w:p>
@@ -707,13 +707,15 @@
           <w:color w:val="1A202C"/>
           <w:sz w:val="20"/>
         </w:rPr>
-        <w:t>La industria guatemalteca sufre una paradoja crónica en su gestión operativa: gasta sumas millonarias en maquinaria de última generación (Industria 4.0, PLCs, redes, robótica), pero tropieza sistemáticamente al seleccionar al personal que debe operarla y mantenerla:</w:t>
+        <w:t>Esta iniciativa responde a una necesidad sentida y compartida entre el sector industrial y la educación técnica superior:</w:t>
         <w:br/>
-        <w:t>• El Error de la Subcualificación: Asignar líneas automatizadas a personal con formación básica empírica o bachilleres sin especialización técnica superior. El resultado es mantenimiento reactivo destructivo, paradas de planta no programadas y mermas intolerables por falta de método analítico de diagnóstico.</w:t>
+        <w:t>• Conocer de Primera Mano las Necesidades Actuales de la Industria: Las tecnologías operativas (automatización, IoT industrial, redes, robótica y manufactura) evolucionan con rapidez. Kinal abre este espacio de diálogo para identificar exactamente qué competencias técnicas y humanas demandan hoy las empresas más dinámicas.</w:t>
         <w:br/>
-        <w:t>• El Error de la Sobrecualificación: Contratar ingenieros universitarios recién graduados para puestos de supervisión de línea o mantenimiento directo. El resultado es frustración inmediata: el ingeniero busca diseño o gestión de oficina, rechaza el trabajo de campo en el taller, percibe el puesto como transitorio y renuncia a los 6 u 8 meses, disparando los costos de rotación.</w:t>
+        <w:t>• Fortalecer a los Profesionales que Lideran Equipos de Trabajo: Muchos supervisores de taller y mandos medios ascienden por sus destrezas técnicas pero carecen de herramientas formales para el manejo de personal, la resolución constructiva de conflictos y el liderazgo motivador.</w:t>
         <w:br/>
-        <w:t>• La Solución Estratégica: El Técnico Superior Universitario (TSU): El grado TSU de Kinal (3 años de educación técnica superior y universitaria, con más de 1,500 horas de prácticas de banco, laboratorios y plantas piloto) representa el 'eslabón perdido' de la productividad nacional. Equivale exactamente al *Meister* (Maestro Técnico) o *Techniker* del sistema alemán (DQR Niveles 5-6): domina la física y el cálculo aplicado, resuelve averías complejas en campo y posee la formación humana para liderar cuadrillas operativas con estabilidad a largo plazo.</w:t>
+        <w:t>• Superar el Dilema del Talento Técnico (Sub vs Sobrecualificación): El sector industrial suele oscilar entre contratar operarios empíricos que no dominan diagnóstico analítico o ingenieros universitarios que se frustran en el trabajo de piso y rotan a los pocos meses. El programa visibiliza el rol del **Técnico Superior Universitario (TSU)** como solución de alto impacto y estabilidad a largo plazo.</w:t>
+        <w:br/>
+        <w:t>• Retroalimentación para la Formación de Estudiantes y Egresados: El diálogo directo con los gerentes permite a Kinal afinar sus mallas curriculares, garantizando que los graduandos salgan al mercado con el perfil exacto que el aparato productivo nacional requiere.</w:t>
       </w:r>
     </w:p>
     <w:p>
@@ -728,7 +730,7 @@
           <w:color w:val="003366"/>
           <w:sz w:val="30"/>
         </w:rPr>
-        <w:t>3. Marco Alemán de Cualificaciones (DQR) y Formación Dual en la Empresa</w:t>
+        <w:t>3. Marco Alemán DQR y Formación Profesional Dual en Alternancia</w:t>
       </w:r>
     </w:p>
     <w:tbl>
@@ -787,7 +789,7 @@
     </w:tbl>
     <w:p>
       <w:pPr>
-        <w:spacing w:before="0" w:after="120" w:line="276" w:lineRule="auto"/>
+        <w:spacing w:before="0" w:after="80"/>
       </w:pPr>
     </w:p>
     <w:tbl>
@@ -829,7 +831,7 @@
                 <w:color w:val="003366"/>
                 <w:sz w:val="20"/>
               </w:rPr>
-              <w:t xml:space="preserve">Concepto de Competencia en el DQR: </w:t>
+              <w:t xml:space="preserve">Concepto de Competencia según el DQR: </w:t>
             </w:r>
             <w:r>
               <w:rPr>
@@ -846,7 +848,7 @@
     </w:tbl>
     <w:p>
       <w:pPr>
-        <w:spacing w:before="0" w:after="120" w:line="276" w:lineRule="auto"/>
+        <w:spacing w:before="0" w:after="80"/>
       </w:pPr>
     </w:p>
     <w:p>
@@ -859,13 +861,7 @@
           <w:color w:val="1A202C"/>
           <w:sz w:val="20"/>
         </w:rPr>
-        <w:t>El diplomado enseña a los gerentes a incorporar los estándares duales en sus propias plantas:</w:t>
-        <w:br/>
-        <w:t>1. Co-Formación en Alternancia: Pasar de la postura pasiva ('esperar a ver qué me envía la academia') a la postura dual activa, donde la empresa se convierte en un centro de aprendizaje estructurado mediante semilleros técnicos y pasantías planificadas.</w:t>
-        <w:br/>
-        <w:t>2. El Tutor Empresarial (Ausbilder): Formar a los jefes de taller y supervisores de línea como mentores técnicos capaces de transferir conocimientos sin egoísmos y guiar al joven en su integración cultural.</w:t>
-        <w:br/>
-        <w:t>3. Evaluación por Resultados de Aprendizaje: Sustituir los filtros basados únicamente en diplomas de papel por pruebas situacionales donde se evidencia la *capacidad integral de acción técnica*.</w:t>
+        <w:t>El programa comparte con los líderes empresariales cómo los estándares duales alemanes (DQR Niveles 5 y 6 / Meister) se aterrizan con éxito en Guatemala a través de convenios de aprendizaje, tutores empresariales (*Ausbilder*) y semilleros de talento en la propia planta.</w:t>
       </w:r>
     </w:p>
     <w:p>
@@ -880,7 +876,7 @@
           <w:color w:val="003366"/>
           <w:sz w:val="30"/>
         </w:rPr>
-        <w:t>4. Competencia General y Perfiles del Participante</w:t>
+        <w:t>4. Competencia General y Perfil de los Participantes</w:t>
       </w:r>
     </w:p>
     <w:p>
@@ -896,7 +892,7 @@
         </w:rPr>
         <w:t>Competencia General del Programa:</w:t>
         <w:br/>
-        <w:t>El participante formula e implementa estrategias integrales de atracción, evaluación, fidelización y desarrollo de talento técnico operativo en su organización, capitalizando las competencias del Técnico Superior Universitario (TSU) y el modelo de formación dual, diseñando programas internos de Factor Humano basados en valores laicos universales para erradicar el maltrato en planta y elevar la productividad y seguridad laboral con el estándar del «trabajo bien hecho».</w:t>
+        <w:t>El participante aplica herramientas directivas contemporáneas para el manejo, desarrollo y liderazgo de personal técnico y mandos medios, integrando la cultura del Factor Humano y el estándar del «trabajo bien hecho» en sus cuadrillas operativas, y participa activamente en el diálogo de vinculación industria-academia para identificar y fortalecer las competencias técnicas y humanas demandadas por el sector productivo.</w:t>
       </w:r>
     </w:p>
     <w:p>
@@ -909,9 +905,9 @@
           <w:color w:val="1A202C"/>
           <w:sz w:val="20"/>
         </w:rPr>
-        <w:t>• Perfil de Ingreso: Gerentes Generales, Directores de Recursos Humanos / Talento Humano, Gerentes de Planta, Jefes de Reclutamiento, Gerentes de Mantenimiento y líderes de operaciones en empresas del sector manufacturero, agroindustrial, telecomunicaciones, energía, servicios técnicos y construcción en Guatemala.</w:t>
+        <w:t>• Perfil de Ingreso: Representantes de empresas con responsabilidad sobre equipos de trabajo: Gerentes Generales, Gerentes de Operaciones, Planta o Mantenimiento, Directores/Gerentes de Talento Humano y Recursos Humanos, Reclutadores Técnicos y Supervisores Generales de sectores como manufactura, agroindustria, plásticos, alimentos, telecomunicaciones, energía y servicios técnicos.</w:t>
         <w:br/>
-        <w:t>• Perfil de Egreso: Líder estratégico certificado capaz de estructurar matrices de competencias operativas precisas, reducir drásticamente el costo de rotación técnica, establecer semilleros duales con Fundación Kinal y liderar programas de Factor Humano que humanicen los procesos productivos.</w:t>
+        <w:t>• Perfil de Egreso: Líder empresarial actualizado con visión integral del talento técnico, capaz de liderar a sus mandos medios con empatía y exigencia profesional, erradicar el maltrato en planta, estructurar semilleros de aprendizaje y vincular a su organización en alianzas estratégicas de empleabilidad con Fundación Kinal.</w:t>
       </w:r>
     </w:p>
     <w:p>
@@ -926,7 +922,20 @@
           <w:color w:val="003366"/>
           <w:sz w:val="30"/>
         </w:rPr>
-        <w:t>5. Estructura Modular y Distribución Formativa (4 Semanas Consecutivas)</w:t>
+        <w:t>5. Estructura Formativa Oficial (1 Mes de Duración | Híbrido Ejecutivo)</w:t>
+      </w:r>
+    </w:p>
+    <w:p>
+      <w:pPr>
+        <w:spacing w:before="0" w:after="120" w:line="276" w:lineRule="auto"/>
+      </w:pPr>
+      <w:r>
+        <w:rPr>
+          <w:rFonts w:ascii="Calibri" w:hAnsi="Calibri"/>
+          <w:color w:val="1A202C"/>
+          <w:sz w:val="20"/>
+        </w:rPr>
+        <w:t>El programa ha sido diseñado para maximizar el aprovechamiento del tiempo de los ejecutivos y representantes empresariales, articulando **1 sesión semanal virtual** a lo largo de un mes con **2 jornadas presenciales especiales** en las instalaciones de Fundación Kinal:</w:t>
       </w:r>
     </w:p>
     <w:tbl>
@@ -945,11 +954,11 @@
         </w:tblBorders>
       </w:tblPr>
       <w:tblGrid>
+        <w:gridCol w:w="1872"/>
+        <w:gridCol w:w="3168"/>
+        <w:gridCol w:w="1008"/>
         <w:gridCol w:w="1584"/>
-        <w:gridCol w:w="3024"/>
-        <w:gridCol w:w="1152"/>
-        <w:gridCol w:w="1584"/>
-        <w:gridCol w:w="2016"/>
+        <w:gridCol w:w="1728"/>
       </w:tblGrid>
       <w:tr>
         <w:tc>
@@ -968,7 +977,7 @@
                 <w:color w:val="FFFFFF"/>
                 <w:sz w:val="17"/>
               </w:rPr>
-              <w:t>Módulo / Semana</w:t>
+              <w:t>Encuentro / Modalidad</w:t>
             </w:r>
           </w:p>
         </w:tc>
@@ -988,7 +997,7 @@
                 <w:color w:val="FFFFFF"/>
                 <w:sz w:val="17"/>
               </w:rPr>
-              <w:t>Nombre de la Unidad Formativa</w:t>
+              <w:t>Nombre del Módulo / Actividad</w:t>
             </w:r>
           </w:p>
         </w:tc>
@@ -1028,7 +1037,7 @@
                 <w:color w:val="FFFFFF"/>
                 <w:sz w:val="17"/>
               </w:rPr>
-              <w:t>Sesiones</w:t>
+              <w:t>Formato / Plataforma</w:t>
             </w:r>
           </w:p>
         </w:tc>
@@ -1048,7 +1057,7 @@
                 <w:color w:val="FFFFFF"/>
                 <w:sz w:val="17"/>
               </w:rPr>
-              <w:t>Producto Terminal del Módulo</w:t>
+              <w:t>Producto Observable</w:t>
             </w:r>
           </w:p>
         </w:tc>
@@ -1057,12 +1066,12 @@
         <w:tc>
           <w:tcPr>
             <w:tcW w:type="dxa" w:w="1872"/>
-            <w:shd w:fill="F7FAFC"/>
+            <w:shd w:fill="EBF8FF"/>
             <w:tcMar>
-              <w:top w:w="55" w:type="dxa"/>
-              <w:bottom w:w="55" w:type="dxa"/>
-              <w:left w:w="65" w:type="dxa"/>
-              <w:right w:w="65" w:type="dxa"/>
+              <w:top w:w="50" w:type="dxa"/>
+              <w:bottom w:w="50" w:type="dxa"/>
+              <w:left w:w="60" w:type="dxa"/>
+              <w:right w:w="60" w:type="dxa"/>
             </w:tcMar>
           </w:tcPr>
           <w:p>
@@ -1076,44 +1085,19 @@
                 <w:color w:val="1A202C"/>
                 <w:sz w:val="17"/>
               </w:rPr>
-              <w:t>Módulo 1 (Semana 1)</w:t>
+              <w:t>Jornada Especial 1 (Presencial)</w:t>
             </w:r>
           </w:p>
         </w:tc>
         <w:tc>
           <w:tcPr>
             <w:tcW w:type="dxa" w:w="1872"/>
-            <w:shd w:fill="F7FAFC"/>
+            <w:shd w:fill="EBF8FF"/>
             <w:tcMar>
-              <w:top w:w="55" w:type="dxa"/>
-              <w:bottom w:w="55" w:type="dxa"/>
-              <w:left w:w="65" w:type="dxa"/>
-              <w:right w:w="65" w:type="dxa"/>
-            </w:tcMar>
-          </w:tcPr>
-          <w:p>
-            <w:pPr>
-              <w:spacing w:before="0" w:after="0" w:line="276" w:lineRule="auto"/>
-            </w:pPr>
-            <w:r>
-              <w:rPr>
-                <w:rFonts w:ascii="Calibri" w:hAnsi="Calibri"/>
-                <w:color w:val="1A202C"/>
-                <w:sz w:val="17"/>
-              </w:rPr>
-              <w:t>El Valor del TSU y la Radiografía del Talento Operativo en Guatemala</w:t>
-            </w:r>
-          </w:p>
-        </w:tc>
-        <w:tc>
-          <w:tcPr>
-            <w:tcW w:type="dxa" w:w="1872"/>
-            <w:shd w:fill="F7FAFC"/>
-            <w:tcMar>
-              <w:top w:w="55" w:type="dxa"/>
-              <w:bottom w:w="55" w:type="dxa"/>
-              <w:left w:w="65" w:type="dxa"/>
-              <w:right w:w="65" w:type="dxa"/>
+              <w:top w:w="50" w:type="dxa"/>
+              <w:bottom w:w="50" w:type="dxa"/>
+              <w:left w:w="60" w:type="dxa"/>
+              <w:right w:w="60" w:type="dxa"/>
             </w:tcMar>
           </w:tcPr>
           <w:p>
@@ -1127,70 +1111,19 @@
                 <w:color w:val="1A202C"/>
                 <w:sz w:val="17"/>
               </w:rPr>
-              <w:t>8 Horas</w:t>
+              <w:t>Apertura Institucional, Presentación de la Iniciativa y Recorrido por Talleres de Kinal</w:t>
             </w:r>
           </w:p>
         </w:tc>
         <w:tc>
           <w:tcPr>
             <w:tcW w:type="dxa" w:w="1872"/>
-            <w:shd w:fill="F7FAFC"/>
+            <w:shd w:fill="EBF8FF"/>
             <w:tcMar>
-              <w:top w:w="55" w:type="dxa"/>
-              <w:bottom w:w="55" w:type="dxa"/>
-              <w:left w:w="65" w:type="dxa"/>
-              <w:right w:w="65" w:type="dxa"/>
-            </w:tcMar>
-          </w:tcPr>
-          <w:p>
-            <w:pPr>
-              <w:spacing w:before="0" w:after="0" w:line="276" w:lineRule="auto"/>
-            </w:pPr>
-            <w:r>
-              <w:rPr>
-                <w:rFonts w:ascii="Calibri" w:hAnsi="Calibri"/>
-                <w:color w:val="1A202C"/>
-                <w:sz w:val="17"/>
-              </w:rPr>
-              <w:t>2 Virtuales (4h) + Sábado 1 Kinal (4h)</w:t>
-            </w:r>
-          </w:p>
-        </w:tc>
-        <w:tc>
-          <w:tcPr>
-            <w:tcW w:type="dxa" w:w="1872"/>
-            <w:shd w:fill="F7FAFC"/>
-            <w:tcMar>
-              <w:top w:w="55" w:type="dxa"/>
-              <w:bottom w:w="55" w:type="dxa"/>
-              <w:left w:w="65" w:type="dxa"/>
-              <w:right w:w="65" w:type="dxa"/>
-            </w:tcMar>
-          </w:tcPr>
-          <w:p>
-            <w:pPr>
-              <w:spacing w:before="0" w:after="0" w:line="276" w:lineRule="auto"/>
-            </w:pPr>
-            <w:r>
-              <w:rPr>
-                <w:rFonts w:ascii="Calibri" w:hAnsi="Calibri"/>
-                <w:color w:val="1A202C"/>
-                <w:sz w:val="17"/>
-              </w:rPr>
-              <w:t>Diagnóstico de Brechas Operativas y Caso de Negocio (ROI del TSU)</w:t>
-            </w:r>
-          </w:p>
-        </w:tc>
-      </w:tr>
-      <w:tr>
-        <w:tc>
-          <w:tcPr>
-            <w:tcW w:type="dxa" w:w="1872"/>
-            <w:tcMar>
-              <w:top w:w="55" w:type="dxa"/>
-              <w:bottom w:w="55" w:type="dxa"/>
-              <w:left w:w="65" w:type="dxa"/>
-              <w:right w:w="65" w:type="dxa"/>
+              <w:top w:w="50" w:type="dxa"/>
+              <w:bottom w:w="50" w:type="dxa"/>
+              <w:left w:w="60" w:type="dxa"/>
+              <w:right w:w="60" w:type="dxa"/>
             </w:tcMar>
           </w:tcPr>
           <w:p>
@@ -1204,42 +1137,19 @@
                 <w:color w:val="1A202C"/>
                 <w:sz w:val="17"/>
               </w:rPr>
-              <w:t>Módulo 2 (Semana 2)</w:t>
+              <w:t>4 Horas</w:t>
             </w:r>
           </w:p>
         </w:tc>
         <w:tc>
           <w:tcPr>
             <w:tcW w:type="dxa" w:w="1872"/>
+            <w:shd w:fill="EBF8FF"/>
             <w:tcMar>
-              <w:top w:w="55" w:type="dxa"/>
-              <w:bottom w:w="55" w:type="dxa"/>
-              <w:left w:w="65" w:type="dxa"/>
-              <w:right w:w="65" w:type="dxa"/>
-            </w:tcMar>
-          </w:tcPr>
-          <w:p>
-            <w:pPr>
-              <w:spacing w:before="0" w:after="0" w:line="276" w:lineRule="auto"/>
-            </w:pPr>
-            <w:r>
-              <w:rPr>
-                <w:rFonts w:ascii="Calibri" w:hAnsi="Calibri"/>
-                <w:color w:val="1A202C"/>
-                <w:sz w:val="17"/>
-              </w:rPr>
-              <w:t>Reclutamiento por Competencias Técnicas y Sistemas de Formación Dual</w:t>
-            </w:r>
-          </w:p>
-        </w:tc>
-        <w:tc>
-          <w:tcPr>
-            <w:tcW w:type="dxa" w:w="1872"/>
-            <w:tcMar>
-              <w:top w:w="55" w:type="dxa"/>
-              <w:bottom w:w="55" w:type="dxa"/>
-              <w:left w:w="65" w:type="dxa"/>
-              <w:right w:w="65" w:type="dxa"/>
+              <w:top w:w="50" w:type="dxa"/>
+              <w:bottom w:w="50" w:type="dxa"/>
+              <w:left w:w="60" w:type="dxa"/>
+              <w:right w:w="60" w:type="dxa"/>
             </w:tcMar>
           </w:tcPr>
           <w:p>
@@ -1253,69 +1163,19 @@
                 <w:color w:val="1A202C"/>
                 <w:sz w:val="17"/>
               </w:rPr>
-              <w:t>8 Horas</w:t>
+              <w:t>Presencial en Campus Kinal (Sábado o Mañana Ejecutiva)</w:t>
             </w:r>
           </w:p>
         </w:tc>
         <w:tc>
           <w:tcPr>
             <w:tcW w:type="dxa" w:w="1872"/>
+            <w:shd w:fill="EBF8FF"/>
             <w:tcMar>
-              <w:top w:w="55" w:type="dxa"/>
-              <w:bottom w:w="55" w:type="dxa"/>
-              <w:left w:w="65" w:type="dxa"/>
-              <w:right w:w="65" w:type="dxa"/>
-            </w:tcMar>
-          </w:tcPr>
-          <w:p>
-            <w:pPr>
-              <w:spacing w:before="0" w:after="0" w:line="276" w:lineRule="auto"/>
-            </w:pPr>
-            <w:r>
-              <w:rPr>
-                <w:rFonts w:ascii="Calibri" w:hAnsi="Calibri"/>
-                <w:color w:val="1A202C"/>
-                <w:sz w:val="17"/>
-              </w:rPr>
-              <w:t>2 Virtuales (4h) + Sábado 2 Kinal (4h)</w:t>
-            </w:r>
-          </w:p>
-        </w:tc>
-        <w:tc>
-          <w:tcPr>
-            <w:tcW w:type="dxa" w:w="1872"/>
-            <w:tcMar>
-              <w:top w:w="55" w:type="dxa"/>
-              <w:bottom w:w="55" w:type="dxa"/>
-              <w:left w:w="65" w:type="dxa"/>
-              <w:right w:w="65" w:type="dxa"/>
-            </w:tcMar>
-          </w:tcPr>
-          <w:p>
-            <w:pPr>
-              <w:spacing w:before="0" w:after="0" w:line="276" w:lineRule="auto"/>
-            </w:pPr>
-            <w:r>
-              <w:rPr>
-                <w:rFonts w:ascii="Calibri" w:hAnsi="Calibri"/>
-                <w:color w:val="1A202C"/>
-                <w:sz w:val="17"/>
-              </w:rPr>
-              <w:t>Descriptor por Competencias Demostrables y Plan Semillero Dual</w:t>
-            </w:r>
-          </w:p>
-        </w:tc>
-      </w:tr>
-      <w:tr>
-        <w:tc>
-          <w:tcPr>
-            <w:tcW w:type="dxa" w:w="1872"/>
-            <w:shd w:fill="F7FAFC"/>
-            <w:tcMar>
-              <w:top w:w="55" w:type="dxa"/>
-              <w:bottom w:w="55" w:type="dxa"/>
-              <w:left w:w="65" w:type="dxa"/>
-              <w:right w:w="65" w:type="dxa"/>
+              <w:top w:w="50" w:type="dxa"/>
+              <w:bottom w:w="50" w:type="dxa"/>
+              <w:left w:w="60" w:type="dxa"/>
+              <w:right w:w="60" w:type="dxa"/>
             </w:tcMar>
           </w:tcPr>
           <w:p>
@@ -1329,44 +1189,20 @@
                 <w:color w:val="1A202C"/>
                 <w:sz w:val="17"/>
               </w:rPr>
-              <w:t>Módulo 3 (Semana 3)</w:t>
+              <w:t>Encuadre de Vinculación y Diagnóstico Preliminar de Expectativas</w:t>
             </w:r>
           </w:p>
         </w:tc>
+      </w:tr>
+      <w:tr>
         <w:tc>
           <w:tcPr>
             <w:tcW w:type="dxa" w:w="1872"/>
-            <w:shd w:fill="F7FAFC"/>
             <w:tcMar>
-              <w:top w:w="55" w:type="dxa"/>
-              <w:bottom w:w="55" w:type="dxa"/>
-              <w:left w:w="65" w:type="dxa"/>
-              <w:right w:w="65" w:type="dxa"/>
-            </w:tcMar>
-          </w:tcPr>
-          <w:p>
-            <w:pPr>
-              <w:spacing w:before="0" w:after="0" w:line="276" w:lineRule="auto"/>
-            </w:pPr>
-            <w:r>
-              <w:rPr>
-                <w:rFonts w:ascii="Calibri" w:hAnsi="Calibri"/>
-                <w:color w:val="1A202C"/>
-                <w:sz w:val="17"/>
-              </w:rPr>
-              <w:t>Cultura del Factor Humano: Valores Laicos, Dignidad y Clima Operativo</w:t>
-            </w:r>
-          </w:p>
-        </w:tc>
-        <w:tc>
-          <w:tcPr>
-            <w:tcW w:type="dxa" w:w="1872"/>
-            <w:shd w:fill="F7FAFC"/>
-            <w:tcMar>
-              <w:top w:w="55" w:type="dxa"/>
-              <w:bottom w:w="55" w:type="dxa"/>
-              <w:left w:w="65" w:type="dxa"/>
-              <w:right w:w="65" w:type="dxa"/>
+              <w:top w:w="50" w:type="dxa"/>
+              <w:bottom w:w="50" w:type="dxa"/>
+              <w:left w:w="60" w:type="dxa"/>
+              <w:right w:w="60" w:type="dxa"/>
             </w:tcMar>
           </w:tcPr>
           <w:p>
@@ -1380,19 +1216,18 @@
                 <w:color w:val="1A202C"/>
                 <w:sz w:val="17"/>
               </w:rPr>
-              <w:t>8 Horas</w:t>
+              <w:t>Semana 1 / Sesión Virtual 1</w:t>
             </w:r>
           </w:p>
         </w:tc>
         <w:tc>
           <w:tcPr>
             <w:tcW w:type="dxa" w:w="1872"/>
-            <w:shd w:fill="F7FAFC"/>
             <w:tcMar>
-              <w:top w:w="55" w:type="dxa"/>
-              <w:bottom w:w="55" w:type="dxa"/>
-              <w:left w:w="65" w:type="dxa"/>
-              <w:right w:w="65" w:type="dxa"/>
+              <w:top w:w="50" w:type="dxa"/>
+              <w:bottom w:w="50" w:type="dxa"/>
+              <w:left w:w="60" w:type="dxa"/>
+              <w:right w:w="60" w:type="dxa"/>
             </w:tcMar>
           </w:tcPr>
           <w:p>
@@ -1405,45 +1240,18 @@
                 <w:color w:val="1A202C"/>
                 <w:sz w:val="17"/>
               </w:rPr>
-              <w:t>2 Virtuales (4h) + Sábado 3 Kinal (4h)</w:t>
+              <w:t>Manejo y Desarrollo de Personal Técnico: Retención, 'Missing Middle' y Curva de Aprendizaje</w:t>
             </w:r>
           </w:p>
         </w:tc>
         <w:tc>
           <w:tcPr>
             <w:tcW w:type="dxa" w:w="1872"/>
-            <w:shd w:fill="F7FAFC"/>
             <w:tcMar>
-              <w:top w:w="55" w:type="dxa"/>
-              <w:bottom w:w="55" w:type="dxa"/>
-              <w:left w:w="65" w:type="dxa"/>
-              <w:right w:w="65" w:type="dxa"/>
-            </w:tcMar>
-          </w:tcPr>
-          <w:p>
-            <w:pPr>
-              <w:spacing w:before="0" w:after="0" w:line="276" w:lineRule="auto"/>
-            </w:pPr>
-            <w:r>
-              <w:rPr>
-                <w:rFonts w:ascii="Calibri" w:hAnsi="Calibri"/>
-                <w:color w:val="1A202C"/>
-                <w:sz w:val="17"/>
-              </w:rPr>
-              <w:t>Protocolo de Erradicación del Maltrato y Charla de Factor Humano</w:t>
-            </w:r>
-          </w:p>
-        </w:tc>
-      </w:tr>
-      <w:tr>
-        <w:tc>
-          <w:tcPr>
-            <w:tcW w:type="dxa" w:w="1872"/>
-            <w:tcMar>
-              <w:top w:w="55" w:type="dxa"/>
-              <w:bottom w:w="55" w:type="dxa"/>
-              <w:left w:w="65" w:type="dxa"/>
-              <w:right w:w="65" w:type="dxa"/>
+              <w:top w:w="50" w:type="dxa"/>
+              <w:bottom w:w="50" w:type="dxa"/>
+              <w:left w:w="60" w:type="dxa"/>
+              <w:right w:w="60" w:type="dxa"/>
             </w:tcMar>
           </w:tcPr>
           <w:p>
@@ -1457,7 +1265,7 @@
                 <w:color w:val="1A202C"/>
                 <w:sz w:val="17"/>
               </w:rPr>
-              <w:t>Módulo 4 (Semana 4)</w:t>
+              <w:t>2 Horas</w:t>
             </w:r>
           </w:p>
         </w:tc>
@@ -1465,10 +1273,10 @@
           <w:tcPr>
             <w:tcW w:type="dxa" w:w="1872"/>
             <w:tcMar>
-              <w:top w:w="55" w:type="dxa"/>
-              <w:bottom w:w="55" w:type="dxa"/>
-              <w:left w:w="65" w:type="dxa"/>
-              <w:right w:w="65" w:type="dxa"/>
+              <w:top w:w="50" w:type="dxa"/>
+              <w:bottom w:w="50" w:type="dxa"/>
+              <w:left w:w="60" w:type="dxa"/>
+              <w:right w:w="60" w:type="dxa"/>
             </w:tcMar>
           </w:tcPr>
           <w:p>
@@ -1481,7 +1289,7 @@
                 <w:color w:val="1A202C"/>
                 <w:sz w:val="17"/>
               </w:rPr>
-              <w:t>Diseño e Implementación del Programa Corporativo (Proyecto Capstone)</w:t>
+              <w:t>Virtual Sincrónico (Microsoft Teams)</w:t>
             </w:r>
           </w:p>
         </w:tc>
@@ -1489,10 +1297,37 @@
           <w:tcPr>
             <w:tcW w:type="dxa" w:w="1872"/>
             <w:tcMar>
-              <w:top w:w="55" w:type="dxa"/>
-              <w:bottom w:w="55" w:type="dxa"/>
-              <w:left w:w="65" w:type="dxa"/>
-              <w:right w:w="65" w:type="dxa"/>
+              <w:top w:w="50" w:type="dxa"/>
+              <w:bottom w:w="50" w:type="dxa"/>
+              <w:left w:w="60" w:type="dxa"/>
+              <w:right w:w="60" w:type="dxa"/>
+            </w:tcMar>
+          </w:tcPr>
+          <w:p>
+            <w:pPr>
+              <w:spacing w:before="0" w:after="0" w:line="276" w:lineRule="auto"/>
+            </w:pPr>
+            <w:r>
+              <w:rPr>
+                <w:rFonts w:ascii="Calibri" w:hAnsi="Calibri"/>
+                <w:color w:val="1A202C"/>
+                <w:sz w:val="17"/>
+              </w:rPr>
+              <w:t>Mapa de Brechas Operativas y Plan de Inducción Técnica</w:t>
+            </w:r>
+          </w:p>
+        </w:tc>
+      </w:tr>
+      <w:tr>
+        <w:tc>
+          <w:tcPr>
+            <w:tcW w:type="dxa" w:w="1872"/>
+            <w:shd w:fill="F7FAFC"/>
+            <w:tcMar>
+              <w:top w:w="50" w:type="dxa"/>
+              <w:bottom w:w="50" w:type="dxa"/>
+              <w:left w:w="60" w:type="dxa"/>
+              <w:right w:w="60" w:type="dxa"/>
             </w:tcMar>
           </w:tcPr>
           <w:p>
@@ -1506,18 +1341,19 @@
                 <w:color w:val="1A202C"/>
                 <w:sz w:val="17"/>
               </w:rPr>
-              <w:t>8 Horas</w:t>
+              <w:t>Semana 2 / Sesión Virtual 2</w:t>
             </w:r>
           </w:p>
         </w:tc>
         <w:tc>
           <w:tcPr>
             <w:tcW w:type="dxa" w:w="1872"/>
+            <w:shd w:fill="F7FAFC"/>
             <w:tcMar>
-              <w:top w:w="55" w:type="dxa"/>
-              <w:bottom w:w="55" w:type="dxa"/>
-              <w:left w:w="65" w:type="dxa"/>
-              <w:right w:w="65" w:type="dxa"/>
+              <w:top w:w="50" w:type="dxa"/>
+              <w:bottom w:w="50" w:type="dxa"/>
+              <w:left w:w="60" w:type="dxa"/>
+              <w:right w:w="60" w:type="dxa"/>
             </w:tcMar>
           </w:tcPr>
           <w:p>
@@ -1530,18 +1366,45 @@
                 <w:color w:val="1A202C"/>
                 <w:sz w:val="17"/>
               </w:rPr>
-              <w:t>2 Virtuales (4h) + Sábado 4 Kinal (4h)</w:t>
+              <w:t>Liderazgo y Factor Humano: Dignidad, Trabajo Bien Hecho y Erradicación del Maltrato</w:t>
             </w:r>
           </w:p>
         </w:tc>
         <w:tc>
           <w:tcPr>
             <w:tcW w:type="dxa" w:w="1872"/>
+            <w:shd w:fill="F7FAFC"/>
             <w:tcMar>
-              <w:top w:w="55" w:type="dxa"/>
-              <w:bottom w:w="55" w:type="dxa"/>
-              <w:left w:w="65" w:type="dxa"/>
-              <w:right w:w="65" w:type="dxa"/>
+              <w:top w:w="50" w:type="dxa"/>
+              <w:bottom w:w="50" w:type="dxa"/>
+              <w:left w:w="60" w:type="dxa"/>
+              <w:right w:w="60" w:type="dxa"/>
+            </w:tcMar>
+          </w:tcPr>
+          <w:p>
+            <w:pPr>
+              <w:spacing w:before="0" w:after="0" w:line="276" w:lineRule="auto"/>
+            </w:pPr>
+            <w:r>
+              <w:rPr>
+                <w:rFonts w:ascii="Calibri" w:hAnsi="Calibri"/>
+                <w:b/>
+                <w:color w:val="1A202C"/>
+                <w:sz w:val="17"/>
+              </w:rPr>
+              <w:t>2 Horas</w:t>
+            </w:r>
+          </w:p>
+        </w:tc>
+        <w:tc>
+          <w:tcPr>
+            <w:tcW w:type="dxa" w:w="1872"/>
+            <w:shd w:fill="F7FAFC"/>
+            <w:tcMar>
+              <w:top w:w="50" w:type="dxa"/>
+              <w:bottom w:w="50" w:type="dxa"/>
+              <w:left w:w="60" w:type="dxa"/>
+              <w:right w:w="60" w:type="dxa"/>
             </w:tcMar>
           </w:tcPr>
           <w:p>
@@ -1554,7 +1417,417 @@
                 <w:color w:val="1A202C"/>
                 <w:sz w:val="17"/>
               </w:rPr>
-              <w:t>Plan Integral de Talento y Factor Humano Evaluado (&gt;= 75 Pts)</w:t>
+              <w:t>Virtual Sincrónico (Microsoft Teams)</w:t>
+            </w:r>
+          </w:p>
+        </w:tc>
+        <w:tc>
+          <w:tcPr>
+            <w:tcW w:type="dxa" w:w="1872"/>
+            <w:shd w:fill="F7FAFC"/>
+            <w:tcMar>
+              <w:top w:w="50" w:type="dxa"/>
+              <w:bottom w:w="50" w:type="dxa"/>
+              <w:left w:w="60" w:type="dxa"/>
+              <w:right w:w="60" w:type="dxa"/>
+            </w:tcMar>
+          </w:tcPr>
+          <w:p>
+            <w:pPr>
+              <w:spacing w:before="0" w:after="0" w:line="276" w:lineRule="auto"/>
+            </w:pPr>
+            <w:r>
+              <w:rPr>
+                <w:rFonts w:ascii="Calibri" w:hAnsi="Calibri"/>
+                <w:color w:val="1A202C"/>
+                <w:sz w:val="17"/>
+              </w:rPr>
+              <w:t>Código de Convivencia Operativa y Protocolo Cero Maltrato</w:t>
+            </w:r>
+          </w:p>
+        </w:tc>
+      </w:tr>
+      <w:tr>
+        <w:tc>
+          <w:tcPr>
+            <w:tcW w:type="dxa" w:w="1872"/>
+            <w:tcMar>
+              <w:top w:w="50" w:type="dxa"/>
+              <w:bottom w:w="50" w:type="dxa"/>
+              <w:left w:w="60" w:type="dxa"/>
+              <w:right w:w="60" w:type="dxa"/>
+            </w:tcMar>
+          </w:tcPr>
+          <w:p>
+            <w:pPr>
+              <w:spacing w:before="0" w:after="0" w:line="276" w:lineRule="auto"/>
+            </w:pPr>
+            <w:r>
+              <w:rPr>
+                <w:rFonts w:ascii="Calibri" w:hAnsi="Calibri"/>
+                <w:b/>
+                <w:color w:val="1A202C"/>
+                <w:sz w:val="17"/>
+              </w:rPr>
+              <w:t>Semana 3 / Sesión Virtual 3</w:t>
+            </w:r>
+          </w:p>
+        </w:tc>
+        <w:tc>
+          <w:tcPr>
+            <w:tcW w:type="dxa" w:w="1872"/>
+            <w:tcMar>
+              <w:top w:w="50" w:type="dxa"/>
+              <w:bottom w:w="50" w:type="dxa"/>
+              <w:left w:w="60" w:type="dxa"/>
+              <w:right w:w="60" w:type="dxa"/>
+            </w:tcMar>
+          </w:tcPr>
+          <w:p>
+            <w:pPr>
+              <w:spacing w:before="0" w:after="0" w:line="276" w:lineRule="auto"/>
+            </w:pPr>
+            <w:r>
+              <w:rPr>
+                <w:rFonts w:ascii="Calibri" w:hAnsi="Calibri"/>
+                <w:color w:val="1A202C"/>
+                <w:sz w:val="17"/>
+              </w:rPr>
+              <w:t>Fortalecimiento de Competencias Técnicas: Estándares DQR 5-6, TSU y Formación Dual</w:t>
+            </w:r>
+          </w:p>
+        </w:tc>
+        <w:tc>
+          <w:tcPr>
+            <w:tcW w:type="dxa" w:w="1872"/>
+            <w:tcMar>
+              <w:top w:w="50" w:type="dxa"/>
+              <w:bottom w:w="50" w:type="dxa"/>
+              <w:left w:w="60" w:type="dxa"/>
+              <w:right w:w="60" w:type="dxa"/>
+            </w:tcMar>
+          </w:tcPr>
+          <w:p>
+            <w:pPr>
+              <w:spacing w:before="0" w:after="0" w:line="276" w:lineRule="auto"/>
+            </w:pPr>
+            <w:r>
+              <w:rPr>
+                <w:rFonts w:ascii="Calibri" w:hAnsi="Calibri"/>
+                <w:b/>
+                <w:color w:val="1A202C"/>
+                <w:sz w:val="17"/>
+              </w:rPr>
+              <w:t>2 Horas</w:t>
+            </w:r>
+          </w:p>
+        </w:tc>
+        <w:tc>
+          <w:tcPr>
+            <w:tcW w:type="dxa" w:w="1872"/>
+            <w:tcMar>
+              <w:top w:w="50" w:type="dxa"/>
+              <w:bottom w:w="50" w:type="dxa"/>
+              <w:left w:w="60" w:type="dxa"/>
+              <w:right w:w="60" w:type="dxa"/>
+            </w:tcMar>
+          </w:tcPr>
+          <w:p>
+            <w:pPr>
+              <w:spacing w:before="0" w:after="0" w:line="276" w:lineRule="auto"/>
+            </w:pPr>
+            <w:r>
+              <w:rPr>
+                <w:rFonts w:ascii="Calibri" w:hAnsi="Calibri"/>
+                <w:color w:val="1A202C"/>
+                <w:sz w:val="17"/>
+              </w:rPr>
+              <w:t>Virtual Sincrónico (Microsoft Teams)</w:t>
+            </w:r>
+          </w:p>
+        </w:tc>
+        <w:tc>
+          <w:tcPr>
+            <w:tcW w:type="dxa" w:w="1872"/>
+            <w:tcMar>
+              <w:top w:w="50" w:type="dxa"/>
+              <w:bottom w:w="50" w:type="dxa"/>
+              <w:left w:w="60" w:type="dxa"/>
+              <w:right w:w="60" w:type="dxa"/>
+            </w:tcMar>
+          </w:tcPr>
+          <w:p>
+            <w:pPr>
+              <w:spacing w:before="0" w:after="0" w:line="276" w:lineRule="auto"/>
+            </w:pPr>
+            <w:r>
+              <w:rPr>
+                <w:rFonts w:ascii="Calibri" w:hAnsi="Calibri"/>
+                <w:color w:val="1A202C"/>
+                <w:sz w:val="17"/>
+              </w:rPr>
+              <w:t>Matriz de Competencias Operativas y Esquema de Rotación Dual</w:t>
+            </w:r>
+          </w:p>
+        </w:tc>
+      </w:tr>
+      <w:tr>
+        <w:tc>
+          <w:tcPr>
+            <w:tcW w:type="dxa" w:w="1872"/>
+            <w:shd w:fill="F7FAFC"/>
+            <w:tcMar>
+              <w:top w:w="50" w:type="dxa"/>
+              <w:bottom w:w="50" w:type="dxa"/>
+              <w:left w:w="60" w:type="dxa"/>
+              <w:right w:w="60" w:type="dxa"/>
+            </w:tcMar>
+          </w:tcPr>
+          <w:p>
+            <w:pPr>
+              <w:spacing w:before="0" w:after="0" w:line="276" w:lineRule="auto"/>
+            </w:pPr>
+            <w:r>
+              <w:rPr>
+                <w:rFonts w:ascii="Calibri" w:hAnsi="Calibri"/>
+                <w:b/>
+                <w:color w:val="1A202C"/>
+                <w:sz w:val="17"/>
+              </w:rPr>
+              <w:t>Semana 4 / Sesión Virtual 4</w:t>
+            </w:r>
+          </w:p>
+        </w:tc>
+        <w:tc>
+          <w:tcPr>
+            <w:tcW w:type="dxa" w:w="1872"/>
+            <w:shd w:fill="F7FAFC"/>
+            <w:tcMar>
+              <w:top w:w="50" w:type="dxa"/>
+              <w:bottom w:w="50" w:type="dxa"/>
+              <w:left w:w="60" w:type="dxa"/>
+              <w:right w:w="60" w:type="dxa"/>
+            </w:tcMar>
+          </w:tcPr>
+          <w:p>
+            <w:pPr>
+              <w:spacing w:before="0" w:after="0" w:line="276" w:lineRule="auto"/>
+            </w:pPr>
+            <w:r>
+              <w:rPr>
+                <w:rFonts w:ascii="Calibri" w:hAnsi="Calibri"/>
+                <w:color w:val="1A202C"/>
+                <w:sz w:val="17"/>
+              </w:rPr>
+              <w:t>Desarrollo de Mandos Medios y Necesidades Actuales de la Industria</w:t>
+            </w:r>
+          </w:p>
+        </w:tc>
+        <w:tc>
+          <w:tcPr>
+            <w:tcW w:type="dxa" w:w="1872"/>
+            <w:shd w:fill="F7FAFC"/>
+            <w:tcMar>
+              <w:top w:w="50" w:type="dxa"/>
+              <w:bottom w:w="50" w:type="dxa"/>
+              <w:left w:w="60" w:type="dxa"/>
+              <w:right w:w="60" w:type="dxa"/>
+            </w:tcMar>
+          </w:tcPr>
+          <w:p>
+            <w:pPr>
+              <w:spacing w:before="0" w:after="0" w:line="276" w:lineRule="auto"/>
+            </w:pPr>
+            <w:r>
+              <w:rPr>
+                <w:rFonts w:ascii="Calibri" w:hAnsi="Calibri"/>
+                <w:b/>
+                <w:color w:val="1A202C"/>
+                <w:sz w:val="17"/>
+              </w:rPr>
+              <w:t>2 Horas</w:t>
+            </w:r>
+          </w:p>
+        </w:tc>
+        <w:tc>
+          <w:tcPr>
+            <w:tcW w:type="dxa" w:w="1872"/>
+            <w:shd w:fill="F7FAFC"/>
+            <w:tcMar>
+              <w:top w:w="50" w:type="dxa"/>
+              <w:bottom w:w="50" w:type="dxa"/>
+              <w:left w:w="60" w:type="dxa"/>
+              <w:right w:w="60" w:type="dxa"/>
+            </w:tcMar>
+          </w:tcPr>
+          <w:p>
+            <w:pPr>
+              <w:spacing w:before="0" w:after="0" w:line="276" w:lineRule="auto"/>
+            </w:pPr>
+            <w:r>
+              <w:rPr>
+                <w:rFonts w:ascii="Calibri" w:hAnsi="Calibri"/>
+                <w:color w:val="1A202C"/>
+                <w:sz w:val="17"/>
+              </w:rPr>
+              <w:t>Virtual Sincrónico (Microsoft Teams)</w:t>
+            </w:r>
+          </w:p>
+        </w:tc>
+        <w:tc>
+          <w:tcPr>
+            <w:tcW w:type="dxa" w:w="1872"/>
+            <w:shd w:fill="F7FAFC"/>
+            <w:tcMar>
+              <w:top w:w="50" w:type="dxa"/>
+              <w:bottom w:w="50" w:type="dxa"/>
+              <w:left w:w="60" w:type="dxa"/>
+              <w:right w:w="60" w:type="dxa"/>
+            </w:tcMar>
+          </w:tcPr>
+          <w:p>
+            <w:pPr>
+              <w:spacing w:before="0" w:after="0" w:line="276" w:lineRule="auto"/>
+            </w:pPr>
+            <w:r>
+              <w:rPr>
+                <w:rFonts w:ascii="Calibri" w:hAnsi="Calibri"/>
+                <w:color w:val="1A202C"/>
+                <w:sz w:val="17"/>
+              </w:rPr>
+              <w:t>Plan de Fortalecimiento de Supervisores y Métricas Operativas (OEE/SSO)</w:t>
+            </w:r>
+          </w:p>
+        </w:tc>
+      </w:tr>
+      <w:tr>
+        <w:tc>
+          <w:tcPr>
+            <w:tcW w:type="dxa" w:w="1872"/>
+            <w:shd w:fill="EBF8FF"/>
+            <w:tcMar>
+              <w:top w:w="50" w:type="dxa"/>
+              <w:bottom w:w="50" w:type="dxa"/>
+              <w:left w:w="60" w:type="dxa"/>
+              <w:right w:w="60" w:type="dxa"/>
+            </w:tcMar>
+          </w:tcPr>
+          <w:p>
+            <w:pPr>
+              <w:spacing w:before="0" w:after="0" w:line="276" w:lineRule="auto"/>
+            </w:pPr>
+            <w:r>
+              <w:rPr>
+                <w:rFonts w:ascii="Calibri" w:hAnsi="Calibri"/>
+                <w:b/>
+                <w:color w:val="1A202C"/>
+                <w:sz w:val="17"/>
+              </w:rPr>
+              <w:t>Jornada Especial 2 (Presencial)</w:t>
+            </w:r>
+          </w:p>
+        </w:tc>
+        <w:tc>
+          <w:tcPr>
+            <w:tcW w:type="dxa" w:w="1872"/>
+            <w:shd w:fill="EBF8FF"/>
+            <w:tcMar>
+              <w:top w:w="50" w:type="dxa"/>
+              <w:bottom w:w="50" w:type="dxa"/>
+              <w:left w:w="60" w:type="dxa"/>
+              <w:right w:w="60" w:type="dxa"/>
+            </w:tcMar>
+          </w:tcPr>
+          <w:p>
+            <w:pPr>
+              <w:spacing w:before="0" w:after="0" w:line="276" w:lineRule="auto"/>
+            </w:pPr>
+            <w:r>
+              <w:rPr>
+                <w:rFonts w:ascii="Calibri" w:hAnsi="Calibri"/>
+                <w:b/>
+                <w:color w:val="1A202C"/>
+                <w:sz w:val="17"/>
+              </w:rPr>
+              <w:t>Plenaria de Diálogo Industria-Academia, Entrega de Diplomas y Reconocimientos</w:t>
+            </w:r>
+          </w:p>
+        </w:tc>
+        <w:tc>
+          <w:tcPr>
+            <w:tcW w:type="dxa" w:w="1872"/>
+            <w:shd w:fill="EBF8FF"/>
+            <w:tcMar>
+              <w:top w:w="50" w:type="dxa"/>
+              <w:bottom w:w="50" w:type="dxa"/>
+              <w:left w:w="60" w:type="dxa"/>
+              <w:right w:w="60" w:type="dxa"/>
+            </w:tcMar>
+          </w:tcPr>
+          <w:p>
+            <w:pPr>
+              <w:spacing w:before="0" w:after="0" w:line="276" w:lineRule="auto"/>
+            </w:pPr>
+            <w:r>
+              <w:rPr>
+                <w:rFonts w:ascii="Calibri" w:hAnsi="Calibri"/>
+                <w:b/>
+                <w:color w:val="1A202C"/>
+                <w:sz w:val="17"/>
+              </w:rPr>
+              <w:t>4 Horas</w:t>
+            </w:r>
+          </w:p>
+        </w:tc>
+        <w:tc>
+          <w:tcPr>
+            <w:tcW w:type="dxa" w:w="1872"/>
+            <w:shd w:fill="EBF8FF"/>
+            <w:tcMar>
+              <w:top w:w="50" w:type="dxa"/>
+              <w:bottom w:w="50" w:type="dxa"/>
+              <w:left w:w="60" w:type="dxa"/>
+              <w:right w:w="60" w:type="dxa"/>
+            </w:tcMar>
+          </w:tcPr>
+          <w:p>
+            <w:pPr>
+              <w:spacing w:before="0" w:after="0" w:line="276" w:lineRule="auto"/>
+            </w:pPr>
+            <w:r>
+              <w:rPr>
+                <w:rFonts w:ascii="Calibri" w:hAnsi="Calibri"/>
+                <w:b/>
+                <w:color w:val="1A202C"/>
+                <w:sz w:val="17"/>
+              </w:rPr>
+              <w:t>Presencial en Campus Kinal (Sábado o Mañana Ejecutiva)</w:t>
+            </w:r>
+          </w:p>
+        </w:tc>
+        <w:tc>
+          <w:tcPr>
+            <w:tcW w:type="dxa" w:w="1872"/>
+            <w:shd w:fill="EBF8FF"/>
+            <w:tcMar>
+              <w:top w:w="50" w:type="dxa"/>
+              <w:bottom w:w="50" w:type="dxa"/>
+              <w:left w:w="60" w:type="dxa"/>
+              <w:right w:w="60" w:type="dxa"/>
+            </w:tcMar>
+          </w:tcPr>
+          <w:p>
+            <w:pPr>
+              <w:spacing w:before="0" w:after="0" w:line="276" w:lineRule="auto"/>
+            </w:pPr>
+            <w:r>
+              <w:rPr>
+                <w:rFonts w:ascii="Calibri" w:hAnsi="Calibri"/>
+                <w:b/>
+                <w:color w:val="1A202C"/>
+                <w:sz w:val="17"/>
+              </w:rPr>
+              <w:t>Consolidado de Demandas Técnicas y Diplomas Oficiales Entregados</w:t>
             </w:r>
           </w:p>
         </w:tc>
@@ -1570,15 +1843,15 @@
           <w:color w:val="1A202C"/>
           <w:sz w:val="19"/>
         </w:rPr>
-        <w:t>Balance de la Modalidad Híbrida Ejecutiva (4 Semanas Intensivas Consecutivas):</w:t>
+        <w:t>Balance de la Carga Horaria y Formativa:</w:t>
         <w:br/>
-        <w:t>• Ritmo Continuo sin Interrupciones: 4 semanas calendario consecutivas de inmersión ejecutiva.</w:t>
+        <w:t>• 8 Horas Presenciales Vivenciales (2 Jornadas Especiales en Kinal): Jornada Inicial de Apertura (4h) para presentar la iniciativa, networking y recorrido de laboratorios; Jornada de Cierre (4h) para plenaria de diálogo industria-academia, entrega solemne de diplomas y reconocimientos, y cóctel de vinculación.</w:t>
         <w:br/>
-        <w:t>• 16 Horas Virtuales Sincrónicas en Microsoft Teams: 8 sesiones nocturnas de 2 horas (Martes y Jueves de 19:00 a 21:00 hrs) dedicadas al marco conceptual, herramientas directivas y análisis de casos.</w:t>
+        <w:t>• 8 Horas Virtuales Sincrónicas en Microsoft Teams: 4 sesiones semanales de 2 horas (1 sesión por semana) dedicadas a herramientas de gestión, liderazgo, factor humano y mandos medios.</w:t>
         <w:br/>
-        <w:t>• 16 Horas Presenciales en Kinal (4 Sábados Consecutivos sin sábados de por medio): 4 sábados consecutivos de 4 horas (8:00 a 12:00 hrs) con inmersión en talleres y laboratorios de TSU, networking directivo y sustentación.</w:t>
+        <w:t>• 4 Horas de Autodiagnóstico en Kinal.academy (Moodle): Ficha de levantamiento de necesidades de cualificación y plan de mejora operativa.</w:t>
         <w:br/>
-        <w:t>• Plataforma LMS Kinal.academy (Moodle): Alojamiento de lecturas ejecutivas, rúbricas y entrega del Proyecto Capstone.</w:t>
+        <w:t>• Total: 20 Horas Formativas Ejecutivas.</w:t>
       </w:r>
     </w:p>
     <w:p>
@@ -1593,26 +1866,122 @@
           <w:color w:val="003366"/>
           <w:sz w:val="30"/>
         </w:rPr>
-        <w:t>6. Estrategia Pedagógica Ejecutiva e Inmersión Vivencial</w:t>
+        <w:t>6. Articulación de los 5 Ejes Temáticos del Programa</w:t>
       </w:r>
     </w:p>
     <w:p>
       <w:pPr>
-        <w:spacing w:before="0" w:after="120" w:line="276" w:lineRule="auto"/>
+        <w:spacing w:before="40" w:after="80" w:line="276" w:lineRule="auto"/>
+        <w:ind w:left="288"/>
       </w:pPr>
       <w:r>
         <w:rPr>
           <w:rFonts w:ascii="Calibri" w:hAnsi="Calibri"/>
+          <w:b/>
+          <w:color w:val="003366"/>
+          <w:sz w:val="19"/>
+        </w:rPr>
+        <w:t xml:space="preserve">• 1. Manejo y Desarrollo de Personal: </w:t>
+      </w:r>
+      <w:r>
+        <w:rPr>
+          <w:rFonts w:ascii="Calibri" w:hAnsi="Calibri"/>
           <w:color w:val="1A202C"/>
-          <w:sz w:val="20"/>
+          <w:sz w:val="19"/>
         </w:rPr>
-        <w:t>El programa adopta un enfoque andragógico directivo basado en tres pilares:</w:t>
-        <w:br/>
-        <w:t>1. Método del Caso Industrial: Discusión guiada de situaciones reales de empresas guatemaltecas (conflictos de cuadrilla, accidentes por descuido, rotación crítica de técnicos, reclutamiento fallido).</w:t>
-        <w:br/>
-        <w:t>2. Inmersión Vivencial en Laboratorios de Kinal (4 Sábados Consecutivos): Durante cada sábado consecutivo, los gerentes recorren los laboratorios de automatización, mecatrónica, redes, ciberseguridad y manufactura, dialogando directamente con estudiantes de TSU que exponen sus proyectos finales. Esto desmitifica de forma palpable la capacidad técnica y madurez de los graduandos.</w:t>
-        <w:br/>
-        <w:t>3. Proyecto Directivo Capstone: Cada gerente participante desarrolla a lo largo de las 4 semanas el 'Plan de Talento Técnico y Cultura del Factor Humano' aplicable directamente a su empresa real, con asesoría individualizada de expertos de Kinal.</w:t>
+        <w:t>Métodos modernos de atracción, onboarding e inducción técnica. Identificación temprana de talento operativo, diseño de curvas de aprendizaje y reducción de la rotación en líneas de producción y talleres.</w:t>
+      </w:r>
+    </w:p>
+    <w:p>
+      <w:pPr>
+        <w:spacing w:before="40" w:after="80" w:line="276" w:lineRule="auto"/>
+        <w:ind w:left="288"/>
+      </w:pPr>
+      <w:r>
+        <w:rPr>
+          <w:rFonts w:ascii="Calibri" w:hAnsi="Calibri"/>
+          <w:b/>
+          <w:color w:val="003366"/>
+          <w:sz w:val="19"/>
+        </w:rPr>
+        <w:t xml:space="preserve">• 2. Liderazgo y Factor Humano: </w:t>
+      </w:r>
+      <w:r>
+        <w:rPr>
+          <w:rFonts w:ascii="Calibri" w:hAnsi="Calibri"/>
+          <w:color w:val="1A202C"/>
+          <w:sz w:val="19"/>
+        </w:rPr>
+        <w:t>La filosofía del Factor Humano de Fundación Kinal aplicada a cuadrillas: dignidad de la persona, erradicación del maltrato verbal y autoritarismo, fomento del «trabajo bien hecho» y desarrollo de seguridad psicológica.</w:t>
+      </w:r>
+    </w:p>
+    <w:p>
+      <w:pPr>
+        <w:spacing w:before="40" w:after="80" w:line="276" w:lineRule="auto"/>
+        <w:ind w:left="288"/>
+      </w:pPr>
+      <w:r>
+        <w:rPr>
+          <w:rFonts w:ascii="Calibri" w:hAnsi="Calibri"/>
+          <w:b/>
+          <w:color w:val="003366"/>
+          <w:sz w:val="19"/>
+        </w:rPr>
+        <w:t xml:space="preserve">• 3. Fortalecimiento de Competencias Técnicas: </w:t>
+      </w:r>
+      <w:r>
+        <w:rPr>
+          <w:rFonts w:ascii="Calibri" w:hAnsi="Calibri"/>
+          <w:color w:val="1A202C"/>
+          <w:sz w:val="19"/>
+        </w:rPr>
+        <w:t>Mapeo de cualificaciones bajo el Marco Alemán DQR 5-6. Demostración práctica del valor del Técnico Superior Universitario (TSU) y estructuración de semilleros duales escuela-empresa.</w:t>
+      </w:r>
+    </w:p>
+    <w:p>
+      <w:pPr>
+        <w:spacing w:before="40" w:after="80" w:line="276" w:lineRule="auto"/>
+        <w:ind w:left="288"/>
+      </w:pPr>
+      <w:r>
+        <w:rPr>
+          <w:rFonts w:ascii="Calibri" w:hAnsi="Calibri"/>
+          <w:b/>
+          <w:color w:val="003366"/>
+          <w:sz w:val="19"/>
+        </w:rPr>
+        <w:t xml:space="preserve">• 4. Desarrollo de Mandos Medios: </w:t>
+      </w:r>
+      <w:r>
+        <w:rPr>
+          <w:rFonts w:ascii="Calibri" w:hAnsi="Calibri"/>
+          <w:color w:val="1A202C"/>
+          <w:sz w:val="19"/>
+        </w:rPr>
+        <w:t>Herramientas formativas para supervisores, jefes de taller y jefes de turno: comunicación asertiva, resolución de conflictos de equipo, liderazgo pedagógico en el puesto (*Ausbilder*) y medición de KPIs (OEE, SSO).</w:t>
+      </w:r>
+    </w:p>
+    <w:p>
+      <w:pPr>
+        <w:spacing w:before="40" w:after="80" w:line="276" w:lineRule="auto"/>
+        <w:ind w:left="288"/>
+      </w:pPr>
+      <w:r>
+        <w:rPr>
+          <w:rFonts w:ascii="Calibri" w:hAnsi="Calibri"/>
+          <w:b/>
+          <w:color w:val="003366"/>
+          <w:sz w:val="19"/>
+        </w:rPr>
+        <w:t xml:space="preserve">• 5. Necesidades Actuales de la Industria y Vinculación Bidireccional: </w:t>
+      </w:r>
+      <w:r>
+        <w:rPr>
+          <w:rFonts w:ascii="Calibri" w:hAnsi="Calibri"/>
+          <w:color w:val="1A202C"/>
+          <w:sz w:val="19"/>
+        </w:rPr>
+        <w:t>Espacios formales de diálogo estructurado donde las empresas participantes comparten con las autoridades de Kinal sus requerimientos inmediatos y futuros en tecnología, automatización y destrezas humanas.</w:t>
       </w:r>
     </w:p>
     <w:p>
@@ -1627,338 +1996,26 @@
           <w:color w:val="003366"/>
           <w:sz w:val="30"/>
         </w:rPr>
-        <w:t>7. Sistema de Evaluación Institucional y Criterio de Certificación</w:t>
+        <w:t>7. Acreditación Institucional, Diplomas y Reconocimientos</w:t>
       </w:r>
     </w:p>
-    <w:tbl>
-      <w:tblPr>
-        <w:tblW w:type="auto" w:w="0"/>
-        <w:jc w:val="center"/>
-        <w:tblLayout w:type="fixed"/>
-        <w:tblLook w:firstColumn="1" w:firstRow="1" w:lastColumn="0" w:lastRow="0" w:noHBand="0" w:noVBand="1" w:val="04A0"/>
-      </w:tblPr>
-      <w:tblGrid>
-        <w:gridCol w:w="9360"/>
-      </w:tblGrid>
-      <w:tr>
-        <w:tc>
-          <w:tcPr>
-            <w:tcW w:type="dxa" w:w="9360"/>
-            <w:shd w:fill="F7FAFC"/>
-            <w:tcMar>
-              <w:top w:w="120" w:type="dxa"/>
-              <w:bottom w:w="120" w:type="dxa"/>
-              <w:left w:w="180" w:type="dxa"/>
-              <w:right w:w="120" w:type="dxa"/>
-            </w:tcMar>
-            <w:tcBorders>
-              <w:left w:val="single" w:sz="24" w:space="0" w:color="003366"/>
-              <w:top w:val="none"/>
-              <w:bottom w:val="none"/>
-              <w:right w:val="none"/>
-            </w:tcBorders>
-          </w:tcPr>
-          <w:p>
-            <w:pPr>
-              <w:spacing w:before="0" w:after="0" w:line="276" w:lineRule="auto"/>
-            </w:pPr>
-            <w:r>
-              <w:rPr>
-                <w:rFonts w:ascii="Calibri" w:hAnsi="Calibri"/>
-                <w:b/>
-                <w:color w:val="003366"/>
-                <w:sz w:val="20"/>
-              </w:rPr>
-              <w:t xml:space="preserve">Umbral Aprobatorio Institucional Obligatorio: </w:t>
-            </w:r>
-            <w:r>
-              <w:rPr>
-                <w:rFonts w:ascii="Calibri" w:hAnsi="Calibri"/>
-                <w:i/>
-                <w:color w:val="2D3748"/>
-                <w:sz w:val="20"/>
-              </w:rPr>
-              <w:t>La obtención de la certificación ejecutiva emitida por Fundación Kinal exige alcanzar una calificación mínima de 75 puntos sobre 100 en la evaluación continua de casos y en la defensa del Proyecto Directivo Capstone en el Sábado 4 consecutivo, conforme a la normativa de evaluación institucional.</w:t>
-            </w:r>
-          </w:p>
-        </w:tc>
-      </w:tr>
-    </w:tbl>
     <w:p>
       <w:pPr>
         <w:spacing w:before="0" w:after="120" w:line="276" w:lineRule="auto"/>
       </w:pPr>
+      <w:r>
+        <w:rPr>
+          <w:rFonts w:ascii="Calibri" w:hAnsi="Calibri"/>
+          <w:color w:val="1A202C"/>
+          <w:sz w:val="20"/>
+        </w:rPr>
+        <w:t>En la Jornada Presencial de Cierre en campus Kinal se realizará un acto protocolario especial con dos distinciones oficiales:</w:t>
+        <w:br/>
+        <w:t>1. Diploma de Participación Individual: Otorgado al representante empresarial que cumplió con el 80% de asistencia a las sesiones sincrónicas y la entrega de su ficha diagnóstica (con nota mínima aprobatoria institucional de 75/100 puntos).</w:t>
+        <w:br/>
+        <w:t>2. Reconocimiento Empresarial Institucional: Galardón emitido por Fundación Kinal a la empresa participante, acreditándola como «Empresa Aliada en la Vinculación Técnica y Formación del Talento Humano», con acceso prioritario a la Bolsa de Egresados y convenios de formación dual.</w:t>
+      </w:r>
     </w:p>
-    <w:tbl>
-      <w:tblPr>
-        <w:tblW w:type="auto" w:w="0"/>
-        <w:jc w:val="center"/>
-        <w:tblLayout w:type="fixed"/>
-        <w:tblLook w:firstColumn="1" w:firstRow="1" w:lastColumn="0" w:lastRow="0" w:noHBand="0" w:noVBand="1" w:val="04A0"/>
-        <w:tblBorders>
-          <w:top w:val="single" w:sz="4" w:space="0" w:color="CBD5E0"/>
-          <w:bottom w:val="single" w:sz="4" w:space="0" w:color="CBD5E0"/>
-          <w:insideH w:val="single" w:sz="4" w:space="0" w:color="CBD5E0"/>
-          <w:insideV w:val="none"/>
-          <w:left w:val="none"/>
-          <w:right w:val="none"/>
-        </w:tblBorders>
-      </w:tblPr>
-      <w:tblGrid>
-        <w:gridCol w:w="3888"/>
-        <w:gridCol w:w="5472"/>
-      </w:tblGrid>
-      <w:tr>
-        <w:tc>
-          <w:tcPr>
-            <w:tcW w:type="dxa" w:w="4680"/>
-            <w:shd w:fill="003366"/>
-          </w:tcPr>
-          <w:p>
-            <w:pPr>
-              <w:spacing w:before="0" w:after="0" w:line="276" w:lineRule="auto"/>
-            </w:pPr>
-            <w:r>
-              <w:rPr>
-                <w:rFonts w:ascii="Calibri" w:hAnsi="Calibri"/>
-                <w:b/>
-                <w:color w:val="FFFFFF"/>
-                <w:sz w:val="17"/>
-              </w:rPr>
-              <w:t>Componente de Evaluación</w:t>
-            </w:r>
-          </w:p>
-        </w:tc>
-        <w:tc>
-          <w:tcPr>
-            <w:tcW w:type="dxa" w:w="4680"/>
-            <w:shd w:fill="003366"/>
-          </w:tcPr>
-          <w:p>
-            <w:pPr>
-              <w:spacing w:before="0" w:after="0" w:line="276" w:lineRule="auto"/>
-            </w:pPr>
-            <w:r>
-              <w:rPr>
-                <w:rFonts w:ascii="Calibri" w:hAnsi="Calibri"/>
-                <w:b/>
-                <w:color w:val="FFFFFF"/>
-                <w:sz w:val="17"/>
-              </w:rPr>
-              <w:t>Criterio de Desempeño y Evidencia</w:t>
-            </w:r>
-          </w:p>
-        </w:tc>
-      </w:tr>
-      <w:tr>
-        <w:tc>
-          <w:tcPr>
-            <w:tcW w:type="dxa" w:w="4680"/>
-            <w:shd w:fill="F7FAFC"/>
-            <w:tcMar>
-              <w:top w:w="55" w:type="dxa"/>
-              <w:bottom w:w="55" w:type="dxa"/>
-              <w:left w:w="65" w:type="dxa"/>
-              <w:right w:w="65" w:type="dxa"/>
-            </w:tcMar>
-          </w:tcPr>
-          <w:p>
-            <w:pPr>
-              <w:spacing w:before="0" w:after="0" w:line="276" w:lineRule="auto"/>
-            </w:pPr>
-            <w:r>
-              <w:rPr>
-                <w:rFonts w:ascii="Calibri" w:hAnsi="Calibri"/>
-                <w:b/>
-                <w:color w:val="1A202C"/>
-                <w:sz w:val="17"/>
-              </w:rPr>
-              <w:t>Participación en Casos y Foros Directivos en Teams (25%)</w:t>
-            </w:r>
-          </w:p>
-        </w:tc>
-        <w:tc>
-          <w:tcPr>
-            <w:tcW w:type="dxa" w:w="4680"/>
-            <w:shd w:fill="F7FAFC"/>
-            <w:tcMar>
-              <w:top w:w="55" w:type="dxa"/>
-              <w:bottom w:w="55" w:type="dxa"/>
-              <w:left w:w="65" w:type="dxa"/>
-              <w:right w:w="65" w:type="dxa"/>
-            </w:tcMar>
-          </w:tcPr>
-          <w:p>
-            <w:pPr>
-              <w:spacing w:before="0" w:after="0" w:line="276" w:lineRule="auto"/>
-            </w:pPr>
-            <w:r>
-              <w:rPr>
-                <w:rFonts w:ascii="Calibri" w:hAnsi="Calibri"/>
-                <w:color w:val="1A202C"/>
-                <w:sz w:val="17"/>
-              </w:rPr>
-              <w:t>Aportes fundamentados en el análisis de dilemas de contratación, casos de rotación y dinámicas de grupo en sesiones virtuales.</w:t>
-            </w:r>
-          </w:p>
-        </w:tc>
-      </w:tr>
-      <w:tr>
-        <w:tc>
-          <w:tcPr>
-            <w:tcW w:type="dxa" w:w="4680"/>
-            <w:tcMar>
-              <w:top w:w="55" w:type="dxa"/>
-              <w:bottom w:w="55" w:type="dxa"/>
-              <w:left w:w="65" w:type="dxa"/>
-              <w:right w:w="65" w:type="dxa"/>
-            </w:tcMar>
-          </w:tcPr>
-          <w:p>
-            <w:pPr>
-              <w:spacing w:before="0" w:after="0" w:line="276" w:lineRule="auto"/>
-            </w:pPr>
-            <w:r>
-              <w:rPr>
-                <w:rFonts w:ascii="Calibri" w:hAnsi="Calibri"/>
-                <w:b/>
-                <w:color w:val="1A202C"/>
-                <w:sz w:val="17"/>
-              </w:rPr>
-              <w:t>Talleres Presenciales e Inmersión en Laboratorios Kinal (25%)</w:t>
-            </w:r>
-          </w:p>
-        </w:tc>
-        <w:tc>
-          <w:tcPr>
-            <w:tcW w:type="dxa" w:w="4680"/>
-            <w:tcMar>
-              <w:top w:w="55" w:type="dxa"/>
-              <w:bottom w:w="55" w:type="dxa"/>
-              <w:left w:w="65" w:type="dxa"/>
-              <w:right w:w="65" w:type="dxa"/>
-            </w:tcMar>
-          </w:tcPr>
-          <w:p>
-            <w:pPr>
-              <w:spacing w:before="0" w:after="0" w:line="276" w:lineRule="auto"/>
-            </w:pPr>
-            <w:r>
-              <w:rPr>
-                <w:rFonts w:ascii="Calibri" w:hAnsi="Calibri"/>
-                <w:color w:val="1A202C"/>
-                <w:sz w:val="17"/>
-              </w:rPr>
-              <w:t>Asistencia activa a los 4 sábados consecutivos en campus Kinal, auditoría de competencias en bancos reales y ejercicios de rol directivo.</w:t>
-            </w:r>
-          </w:p>
-        </w:tc>
-      </w:tr>
-      <w:tr>
-        <w:tc>
-          <w:tcPr>
-            <w:tcW w:type="dxa" w:w="4680"/>
-            <w:shd w:fill="F7FAFC"/>
-            <w:tcMar>
-              <w:top w:w="55" w:type="dxa"/>
-              <w:bottom w:w="55" w:type="dxa"/>
-              <w:left w:w="65" w:type="dxa"/>
-              <w:right w:w="65" w:type="dxa"/>
-            </w:tcMar>
-          </w:tcPr>
-          <w:p>
-            <w:pPr>
-              <w:spacing w:before="0" w:after="0" w:line="276" w:lineRule="auto"/>
-            </w:pPr>
-            <w:r>
-              <w:rPr>
-                <w:rFonts w:ascii="Calibri" w:hAnsi="Calibri"/>
-                <w:b/>
-                <w:color w:val="1A202C"/>
-                <w:sz w:val="17"/>
-              </w:rPr>
-              <w:t>Diseño de Herramientas de Factor Humano (20%)</w:t>
-            </w:r>
-          </w:p>
-        </w:tc>
-        <w:tc>
-          <w:tcPr>
-            <w:tcW w:type="dxa" w:w="4680"/>
-            <w:shd w:fill="F7FAFC"/>
-            <w:tcMar>
-              <w:top w:w="55" w:type="dxa"/>
-              <w:bottom w:w="55" w:type="dxa"/>
-              <w:left w:w="65" w:type="dxa"/>
-              <w:right w:w="65" w:type="dxa"/>
-            </w:tcMar>
-          </w:tcPr>
-          <w:p>
-            <w:pPr>
-              <w:spacing w:before="0" w:after="0" w:line="276" w:lineRule="auto"/>
-            </w:pPr>
-            <w:r>
-              <w:rPr>
-                <w:rFonts w:ascii="Calibri" w:hAnsi="Calibri"/>
-                <w:color w:val="1A202C"/>
-                <w:sz w:val="17"/>
-              </w:rPr>
-              <w:t>Elaboración de matrices de reclutamiento por competencias y protocolos de charlas de Factor Humano para mandos medios.</w:t>
-            </w:r>
-          </w:p>
-        </w:tc>
-      </w:tr>
-      <w:tr>
-        <w:tc>
-          <w:tcPr>
-            <w:tcW w:type="dxa" w:w="4680"/>
-            <w:tcMar>
-              <w:top w:w="55" w:type="dxa"/>
-              <w:bottom w:w="55" w:type="dxa"/>
-              <w:left w:w="65" w:type="dxa"/>
-              <w:right w:w="65" w:type="dxa"/>
-            </w:tcMar>
-          </w:tcPr>
-          <w:p>
-            <w:pPr>
-              <w:spacing w:before="0" w:after="0" w:line="276" w:lineRule="auto"/>
-            </w:pPr>
-            <w:r>
-              <w:rPr>
-                <w:rFonts w:ascii="Calibri" w:hAnsi="Calibri"/>
-                <w:b/>
-                <w:color w:val="1A202C"/>
-                <w:sz w:val="17"/>
-              </w:rPr>
-              <w:t>Defensa del Proyecto Directivo Capstone (30%)</w:t>
-            </w:r>
-          </w:p>
-        </w:tc>
-        <w:tc>
-          <w:tcPr>
-            <w:tcW w:type="dxa" w:w="4680"/>
-            <w:tcMar>
-              <w:top w:w="55" w:type="dxa"/>
-              <w:bottom w:w="55" w:type="dxa"/>
-              <w:left w:w="65" w:type="dxa"/>
-              <w:right w:w="65" w:type="dxa"/>
-            </w:tcMar>
-          </w:tcPr>
-          <w:p>
-            <w:pPr>
-              <w:spacing w:before="0" w:after="0" w:line="276" w:lineRule="auto"/>
-            </w:pPr>
-            <w:r>
-              <w:rPr>
-                <w:rFonts w:ascii="Calibri" w:hAnsi="Calibri"/>
-                <w:color w:val="1A202C"/>
-                <w:sz w:val="17"/>
-              </w:rPr>
-              <w:t>Presentación oral y escrita del Plan Integral de Talento Técnico y Factor Humano para su empresa ante el comité evaluador de Kinal en el Sábado 4.</w:t>
-            </w:r>
-          </w:p>
-        </w:tc>
-      </w:tr>
-    </w:tbl>
     <w:p>
       <w:pPr>
         <w:keepNext/>
@@ -1971,7 +2028,7 @@
           <w:color w:val="003366"/>
           <w:sz w:val="30"/>
         </w:rPr>
-        <w:t>8. Ecosistema Digital Institucional y Espacios Físicos</w:t>
+        <w:t>8. Ecosistema Digital e Infraestructura Institucional</w:t>
       </w:r>
     </w:p>
     <w:p>
@@ -1986,11 +2043,11 @@
         </w:rPr>
         <w:t>En cumplimiento de los estándares institucionales de Fundación Kinal:</w:t>
         <w:br/>
-        <w:t>• Plataforma Virtual Sincrónica: Microsoft Teams para las 8 sesiones nocturnas interactivas, con canales dedicados para análisis de casos y repositorio de grabaciones.</w:t>
+        <w:t>• Plataforma Virtual Sincrónica: Microsoft Teams para las 4 sesiones semanales interactivas, con salas para dinámicas grupales y grabación de respaldo.</w:t>
         <w:br/>
-        <w:t>• Plataforma LMS Oficial: Kinal.academy (Moodle) para la gestión académica, descarga de lecturas de liderazgo, rúbricas de evaluación y entrega formal del Proyecto Capstone.</w:t>
+        <w:t>• Plataforma LMS Oficial: Kinal.academy (Moodle) para la gestión del material de lectura, instrumentos de autodiagnóstico y levantamiento de necesidades de la industria.</w:t>
         <w:br/>
-        <w:t>• Instalaciones Presenciales en Kinal: Auditorio con soporte multimedia, salas de trabajo ejecutivo y recorrido guiado por los talleres de TSU (Laboratorios de Automatización Siemens, Mecatrónica CNC, Electrónica y Redes) durante los 4 sábados consecutivos.</w:t>
+        <w:t>• Instalaciones Presenciales en Kinal: Auditorio Ejecutivo climatizado con soporte audiovisual de alta fidelidad, salas de coworking directivo y visita inmersiva a los Laboratorios de Automatización Siemens, Mecatrónica CNC, Electrónica, Redes y Talleres Industriales.</w:t>
       </w:r>
     </w:p>
     <w:sectPr>
@@ -2018,7 +2075,7 @@
         <w:color w:val="4A5568"/>
         <w:sz w:val="17"/>
       </w:rPr>
-      <w:t>Fundación Kinal | Diplomado de Certificación Gerencial en Gestión del Talento Técnico — Propuesta Oficial</w:t>
+      <w:t>Fundación Kinal | Programa Ejecutivo de Vinculación en Talento Técnico y Factor Humano — Propuesta Oficial</w:t>
     </w:r>
   </w:p>
 </w:ftr>

</xml_diff>